<commit_message>
Neo4j database data and GraphQL testing queries
</commit_message>
<xml_diff>
--- a/Documentation/CAHIER DES CHARGES - GRAPHIMMO.docx
+++ b/Documentation/CAHIER DES CHARGES - GRAPHIMMO.docx
@@ -56,7 +56,7 @@
     </w:p>
     <w:p>
       <w:r>
-        <w:t>Le projet </w:t>
+        <w:t xml:space="preserve">Le projet </w:t>
       </w:r>
       <w:proofErr w:type="spellStart"/>
       <w:r>
@@ -64,7 +64,19 @@
       </w:r>
       <w:proofErr w:type="spellEnd"/>
       <w:r>
-        <w:t xml:space="preserve"> vise à développer une plateforme web de recommandation immobilière intelligente exploitant les bases de données orientées graphes (Neo4j) pour gérer les relations complexes entre propriétés, utilisateurs et agences. L'application permet aux visiteurs de rechercher, filtrer et consulter des biens immobiliers sans création de compte, tout en offrant des fonctionnalités avancées (favoris, </w:t>
+        <w:t xml:space="preserve"> vise à développer</w:t>
+      </w:r>
+      <w:r>
+        <w:t xml:space="preserve"> </w:t>
+      </w:r>
+      <w:r>
+        <w:t>une plateforme web</w:t>
+      </w:r>
+      <w:r>
+        <w:t xml:space="preserve"> </w:t>
+      </w:r>
+      <w:r>
+        <w:t xml:space="preserve">de recommandation immobilière intelligente exploitant les bases de données orientées graphes (Neo4j) pour gérer les relations complexes entre propriétés, utilisateurs et agences. L'application permet aux visiteurs de rechercher, filtrer et consulter des biens immobiliers sans création de compte, tout en offrant des fonctionnalités avancées (favoris, </w:t>
       </w:r>
       <w:proofErr w:type="spellStart"/>
       <w:r>
@@ -72,7 +84,10 @@
       </w:r>
       <w:proofErr w:type="spellEnd"/>
       <w:r>
-        <w:t>, recommandations personnalisées, demandes de visite) aux utilisateurs connectés. L'objectif est d'améliorer l'expérience utilisateur grâce à des recommandations intelligentes basées sur les relations graphiques, la géolocalisation et des algorithmes d'apprentissage.​</w:t>
+        <w:t>, recommandations personnalisées, demandes de visite) aux utilisateurs connectés. L'objectif est d'améliorer l'expérience utilisateur grâce à des recommandations intelligentes basées sur les relations graphiques, la géolocalisation et des algorithmes d'apprentissage.</w:t>
+      </w:r>
+      <w:r>
+        <w:t xml:space="preserve"> </w:t>
       </w:r>
     </w:p>
     <w:p>
@@ -95,7 +110,19 @@
         </w:numPr>
       </w:pPr>
       <w:r>
-        <w:t>Fournir un accès anonyme complet à la recherche, filtrage et consultation de propriétés avec images et données.</w:t>
+        <w:t>Fournir un accès</w:t>
+      </w:r>
+      <w:r>
+        <w:t xml:space="preserve"> </w:t>
+      </w:r>
+      <w:r>
+        <w:t>anonyme</w:t>
+      </w:r>
+      <w:r>
+        <w:t xml:space="preserve"> </w:t>
+      </w:r>
+      <w:r>
+        <w:t>complet à la recherche, filtrage et consultation de propriétés avec images et données.</w:t>
       </w:r>
     </w:p>
     <w:p>
@@ -106,7 +133,19 @@
         </w:numPr>
       </w:pPr>
       <w:r>
-        <w:t>Proposer des recommandations intelligentes basées sur les similarités de propriétés et préférences utilisateurs.</w:t>
+        <w:t>Proposer des</w:t>
+      </w:r>
+      <w:r>
+        <w:t xml:space="preserve"> </w:t>
+      </w:r>
+      <w:r>
+        <w:t>recommandations intelligentes</w:t>
+      </w:r>
+      <w:r>
+        <w:t xml:space="preserve"> </w:t>
+      </w:r>
+      <w:r>
+        <w:t>basées sur les similarités de propriétés et préférences utilisateurs.</w:t>
       </w:r>
     </w:p>
     <w:p>
@@ -117,7 +156,10 @@
         </w:numPr>
       </w:pPr>
       <w:r>
-        <w:t>Permettre le </w:t>
+        <w:t>Permettre le</w:t>
+      </w:r>
+      <w:r>
+        <w:t xml:space="preserve"> </w:t>
       </w:r>
       <w:proofErr w:type="spellStart"/>
       <w:r>
@@ -125,7 +167,13 @@
       </w:r>
       <w:proofErr w:type="spellEnd"/>
       <w:r>
-        <w:t xml:space="preserve"> automatique entre profils acheteurs et propriétés disponibles.</w:t>
+        <w:t xml:space="preserve"> automatique</w:t>
+      </w:r>
+      <w:r>
+        <w:t xml:space="preserve"> </w:t>
+      </w:r>
+      <w:r>
+        <w:t>entre profils acheteurs et propriétés disponibles.</w:t>
       </w:r>
     </w:p>
     <w:p>
@@ -136,7 +184,19 @@
         </w:numPr>
       </w:pPr>
       <w:r>
-        <w:t>Offrir une visualisation cartographique interactive avec géolocalisation et clustering.</w:t>
+        <w:t>Offrir une</w:t>
+      </w:r>
+      <w:r>
+        <w:t xml:space="preserve"> </w:t>
+      </w:r>
+      <w:r>
+        <w:t>visualisation cartographique</w:t>
+      </w:r>
+      <w:r>
+        <w:t xml:space="preserve"> </w:t>
+      </w:r>
+      <w:r>
+        <w:t>interactive avec géolocalisation et clustering.</w:t>
       </w:r>
     </w:p>
     <w:p>
@@ -147,7 +207,19 @@
         </w:numPr>
       </w:pPr>
       <w:r>
-        <w:t>Faciliter les demandes de visite et le suivi des interactions utilisateurs/propriétés.</w:t>
+        <w:t>Faciliter les</w:t>
+      </w:r>
+      <w:r>
+        <w:t xml:space="preserve"> </w:t>
+      </w:r>
+      <w:r>
+        <w:t>demandes de visite</w:t>
+      </w:r>
+      <w:r>
+        <w:t xml:space="preserve"> </w:t>
+      </w:r>
+      <w:r>
+        <w:t>et le suivi des interactions utilisateurs/propriétés.</w:t>
       </w:r>
     </w:p>
     <w:p>
@@ -158,7 +230,19 @@
         </w:numPr>
       </w:pPr>
       <w:r>
-        <w:t>Centraliser les notifications et alertes personnalisées pour nouvelles propriétés ou baisses de prix.</w:t>
+        <w:t>Centraliser les</w:t>
+      </w:r>
+      <w:r>
+        <w:t xml:space="preserve"> </w:t>
+      </w:r>
+      <w:r>
+        <w:t>notifications et alertes</w:t>
+      </w:r>
+      <w:r>
+        <w:t xml:space="preserve"> </w:t>
+      </w:r>
+      <w:r>
+        <w:t>personnalisées pour nouvelles propriétés ou baisses de prix.</w:t>
       </w:r>
     </w:p>
     <w:p>
@@ -169,7 +253,19 @@
         </w:numPr>
       </w:pPr>
       <w:r>
-        <w:t xml:space="preserve">Fournir aux agents immobiliers des statistiques et </w:t>
+        <w:t>Fournir aux</w:t>
+      </w:r>
+      <w:r>
+        <w:t xml:space="preserve"> </w:t>
+      </w:r>
+      <w:r>
+        <w:t>agents immobiliers</w:t>
+      </w:r>
+      <w:r>
+        <w:t xml:space="preserve"> </w:t>
+      </w:r>
+      <w:r>
+        <w:t xml:space="preserve">des statistiques et </w:t>
       </w:r>
       <w:proofErr w:type="spellStart"/>
       <w:r>
@@ -177,7 +273,7 @@
       </w:r>
       <w:proofErr w:type="spellEnd"/>
       <w:r>
-        <w:t xml:space="preserve"> avancés.​</w:t>
+        <w:t xml:space="preserve"> avancés.</w:t>
       </w:r>
     </w:p>
     <w:p>
@@ -259,7 +355,7 @@
         </w:numPr>
       </w:pPr>
       <w:r>
-        <w:t>Aucune connexion requise pour consultation​</w:t>
+        <w:t>Aucune connexion requise pour consultation</w:t>
       </w:r>
     </w:p>
     <w:p>
@@ -316,7 +412,7 @@
         </w:numPr>
       </w:pPr>
       <w:r>
-        <w:t>Zones de recherche géographiques​</w:t>
+        <w:t>Zones de recherche géographiques</w:t>
       </w:r>
     </w:p>
     <w:p>
@@ -361,7 +457,7 @@
         </w:numPr>
       </w:pPr>
       <w:r>
-        <w:t>Gestion profil et préférences​</w:t>
+        <w:t>Gestion profil et préférences</w:t>
       </w:r>
     </w:p>
     <w:p>
@@ -422,7 +518,7 @@
         </w:numPr>
       </w:pPr>
       <w:r>
-        <w:t>Score de recommandation personnalisé​</w:t>
+        <w:t>Score de recommandation personnalisé</w:t>
       </w:r>
     </w:p>
     <w:p>
@@ -467,7 +563,7 @@
         </w:numPr>
       </w:pPr>
       <w:r>
-        <w:t>Suggestions automatiques propriétés compatibles​</w:t>
+        <w:t>Suggestions automatiques propriétés compatibles</w:t>
       </w:r>
     </w:p>
     <w:p>
@@ -512,7 +608,7 @@
         </w:numPr>
       </w:pPr>
       <w:r>
-        <w:t>Dashboard personnel​</w:t>
+        <w:t>Dashboard personnel</w:t>
       </w:r>
     </w:p>
     <w:p>
@@ -576,7 +672,7 @@
         </w:numPr>
       </w:pPr>
       <w:r>
-        <w:t>Historique demandes​</w:t>
+        <w:t>Historique demandes</w:t>
       </w:r>
     </w:p>
     <w:p>
@@ -622,7 +718,7 @@
       </w:pPr>
       <w:r>
         <w:lastRenderedPageBreak/>
-        <w:t>Suggestions propriétés similaires​</w:t>
+        <w:t>Suggestions propriétés similaires</w:t>
       </w:r>
     </w:p>
     <w:p>
@@ -684,7 +780,7 @@
         <w:rPr>
           <w:lang w:val="en-US"/>
         </w:rPr>
-        <w:t>Real-time avec GraphQL subscriptions​</w:t>
+        <w:t>Real-time avec GraphQL subscriptions</w:t>
       </w:r>
     </w:p>
     <w:p>
@@ -740,7 +836,7 @@
         </w:numPr>
       </w:pPr>
       <w:r>
-        <w:t>Tendances prix moyens​</w:t>
+        <w:t>Tendances prix moyens</w:t>
       </w:r>
     </w:p>
     <w:p>
@@ -775,7 +871,13 @@
         </w:numPr>
       </w:pPr>
       <w:r>
-        <w:t>Framework : Python FastAPI (</w:t>
+        <w:t>Framework</w:t>
+      </w:r>
+      <w:r>
+        <w:t xml:space="preserve"> </w:t>
+      </w:r>
+      <w:r>
+        <w:t>: Python FastAPI (</w:t>
       </w:r>
       <w:proofErr w:type="spellStart"/>
       <w:r>
@@ -794,7 +896,13 @@
         </w:numPr>
       </w:pPr>
       <w:r>
-        <w:t>Base de données : Neo4j 5.x (graphe NoSQL)</w:t>
+        <w:t>Base de données</w:t>
+      </w:r>
+      <w:r>
+        <w:t xml:space="preserve"> </w:t>
+      </w:r>
+      <w:r>
+        <w:t>: Neo4j 5.x (graphe NoSQL)</w:t>
       </w:r>
     </w:p>
     <w:p>
@@ -805,7 +913,13 @@
         </w:numPr>
       </w:pPr>
       <w:r>
-        <w:t>API : GraphQL (</w:t>
+        <w:t>API</w:t>
+      </w:r>
+      <w:r>
+        <w:t xml:space="preserve"> </w:t>
+      </w:r>
+      <w:r>
+        <w:t>: GraphQL (</w:t>
       </w:r>
       <w:proofErr w:type="spellStart"/>
       <w:r>
@@ -832,7 +946,13 @@
         </w:numPr>
       </w:pPr>
       <w:r>
-        <w:t>Authentification : JWT sécurisé</w:t>
+        <w:t>Authentification</w:t>
+      </w:r>
+      <w:r>
+        <w:t xml:space="preserve"> </w:t>
+      </w:r>
+      <w:r>
+        <w:t>: JWT sécurisé</w:t>
       </w:r>
     </w:p>
     <w:p>
@@ -843,7 +963,13 @@
         </w:numPr>
       </w:pPr>
       <w:r>
-        <w:t>Driver : neo4j-driver Python 5.10+</w:t>
+        <w:t>Driver</w:t>
+      </w:r>
+      <w:r>
+        <w:t xml:space="preserve"> </w:t>
+      </w:r>
+      <w:r>
+        <w:t>: neo4j-driver Python 5.10+</w:t>
       </w:r>
     </w:p>
     <w:p>
@@ -854,7 +980,13 @@
         </w:numPr>
       </w:pPr>
       <w:r>
-        <w:t xml:space="preserve">Validation : </w:t>
+        <w:t>Validation</w:t>
+      </w:r>
+      <w:r>
+        <w:t xml:space="preserve"> </w:t>
+      </w:r>
+      <w:r>
+        <w:t xml:space="preserve">: </w:t>
       </w:r>
       <w:proofErr w:type="spellStart"/>
       <w:r>
@@ -869,9 +1001,6 @@
         <w:t>safe</w:t>
       </w:r>
       <w:proofErr w:type="spellEnd"/>
-      <w:r>
-        <w:t>​</w:t>
-      </w:r>
     </w:p>
     <w:p>
       <w:pPr>
@@ -893,7 +1022,13 @@
         </w:numPr>
       </w:pPr>
       <w:r>
-        <w:t xml:space="preserve">Framework : </w:t>
+        <w:t>Framework</w:t>
+      </w:r>
+      <w:r>
+        <w:t xml:space="preserve"> </w:t>
+      </w:r>
+      <w:r>
+        <w:t xml:space="preserve">: </w:t>
       </w:r>
       <w:proofErr w:type="spellStart"/>
       <w:r>
@@ -917,7 +1052,13 @@
         </w:numPr>
       </w:pPr>
       <w:r>
-        <w:t>Client GraphQL : Apollo Client 3.6+</w:t>
+        <w:t>Client GraphQL</w:t>
+      </w:r>
+      <w:r>
+        <w:t xml:space="preserve"> </w:t>
+      </w:r>
+      <w:r>
+        <w:t>: Apollo Client 3.6+</w:t>
       </w:r>
     </w:p>
     <w:p>
@@ -928,7 +1069,13 @@
         </w:numPr>
       </w:pPr>
       <w:r>
-        <w:t>Cartographie : Leaflet (open-source)</w:t>
+        <w:t>Cartographie</w:t>
+      </w:r>
+      <w:r>
+        <w:t xml:space="preserve"> </w:t>
+      </w:r>
+      <w:r>
+        <w:t>: Leaflet (open-source)</w:t>
       </w:r>
     </w:p>
     <w:p>
@@ -939,7 +1086,13 @@
         </w:numPr>
       </w:pPr>
       <w:r>
-        <w:t xml:space="preserve">UI Components : </w:t>
+        <w:t>UI Components</w:t>
+      </w:r>
+      <w:r>
+        <w:t xml:space="preserve"> </w:t>
+      </w:r>
+      <w:r>
+        <w:t xml:space="preserve">: </w:t>
       </w:r>
       <w:proofErr w:type="spellStart"/>
       <w:r>
@@ -976,7 +1129,10 @@
       </w:r>
       <w:proofErr w:type="spellEnd"/>
       <w:r>
-        <w:t> : Vite 4+</w:t>
+        <w:t xml:space="preserve"> </w:t>
+      </w:r>
+      <w:r>
+        <w:t>: Vite 4+</w:t>
       </w:r>
     </w:p>
     <w:p>
@@ -987,7 +1143,13 @@
         </w:numPr>
       </w:pPr>
       <w:r>
-        <w:t xml:space="preserve">State management : Apollo Cache + </w:t>
+        <w:t>State management</w:t>
+      </w:r>
+      <w:r>
+        <w:t xml:space="preserve"> </w:t>
+      </w:r>
+      <w:r>
+        <w:t xml:space="preserve">: Apollo Cache + </w:t>
       </w:r>
       <w:proofErr w:type="spellStart"/>
       <w:r>
@@ -995,7 +1157,10 @@
       </w:r>
       <w:proofErr w:type="spellEnd"/>
       <w:r>
-        <w:t xml:space="preserve"> API​</w:t>
+        <w:t xml:space="preserve"> AP</w:t>
+      </w:r>
+      <w:r>
+        <w:t>I</w:t>
       </w:r>
     </w:p>
     <w:p>
@@ -1018,7 +1183,13 @@
         </w:numPr>
       </w:pPr>
       <w:r>
-        <w:t xml:space="preserve">Langage requêtes : </w:t>
+        <w:t>Langage requêtes</w:t>
+      </w:r>
+      <w:r>
+        <w:t xml:space="preserve"> </w:t>
+      </w:r>
+      <w:r>
+        <w:t xml:space="preserve">: </w:t>
       </w:r>
       <w:proofErr w:type="spellStart"/>
       <w:r>
@@ -1034,7 +1205,13 @@
         </w:numPr>
       </w:pPr>
       <w:r>
-        <w:t>Algorithmes graphes : Neo4j GDS (PageRank, similarité)</w:t>
+        <w:t>Algorithmes graphes</w:t>
+      </w:r>
+      <w:r>
+        <w:t xml:space="preserve"> </w:t>
+      </w:r>
+      <w:r>
+        <w:t>: Neo4j GDS (PageRank, similarité)</w:t>
       </w:r>
     </w:p>
     <w:p>
@@ -1046,7 +1223,19 @@
       </w:pPr>
       <w:r>
         <w:lastRenderedPageBreak/>
-        <w:t>Modèle : 8 nœuds + 14 relations (voir section 5)</w:t>
+        <w:t>Modèle</w:t>
+      </w:r>
+      <w:r>
+        <w:t xml:space="preserve"> </w:t>
+      </w:r>
+      <w:r>
+        <w:t>: 8 nœuds + 1</w:t>
+      </w:r>
+      <w:r>
+        <w:t>5</w:t>
+      </w:r>
+      <w:r>
+        <w:t xml:space="preserve"> relations (voir section 5)</w:t>
       </w:r>
     </w:p>
     <w:p>
@@ -1057,7 +1246,13 @@
         </w:numPr>
       </w:pPr>
       <w:r>
-        <w:t>Hébergement : Docker local (MVP), Neo4j Aura (production future)​</w:t>
+        <w:t>Hébergement</w:t>
+      </w:r>
+      <w:r>
+        <w:t xml:space="preserve"> </w:t>
+      </w:r>
+      <w:r>
+        <w:t>: Docker local (MVP), Neo4j Aura (production future)</w:t>
       </w:r>
     </w:p>
     <w:p>
@@ -1108,7 +1303,7 @@
         </w:numPr>
       </w:pPr>
       <w:r>
-        <w:t>CORS configuré pour communication frontend/backend​</w:t>
+        <w:t>CORS configuré pour communication frontend/backend</w:t>
       </w:r>
     </w:p>
     <w:p>
@@ -3677,11 +3872,7 @@
         </w:tc>
       </w:tr>
     </w:tbl>
-    <w:p>
-      <w:r>
-        <w:t>​</w:t>
-      </w:r>
-    </w:p>
+    <w:p/>
     <w:p>
       <w:pPr>
         <w:pStyle w:val="Titre1"/>
@@ -3702,7 +3893,13 @@
         </w:numPr>
       </w:pPr>
       <w:r>
-        <w:t>Accessibilité : Navigation complète sans compte obligatoire (recherche, filtres, cartes, photos)</w:t>
+        <w:t>Accessibilité</w:t>
+      </w:r>
+      <w:r>
+        <w:t xml:space="preserve"> </w:t>
+      </w:r>
+      <w:r>
+        <w:t>: Navigation complète sans compte obligatoire (recherche, filtres, cartes, photos)</w:t>
       </w:r>
     </w:p>
     <w:p>
@@ -3713,7 +3910,13 @@
         </w:numPr>
       </w:pPr>
       <w:r>
-        <w:t>Performance : Temps réponse &lt; 2s pour recherches, traversées graphes optimisés</w:t>
+        <w:t>Performance</w:t>
+      </w:r>
+      <w:r>
+        <w:t xml:space="preserve"> </w:t>
+      </w:r>
+      <w:r>
+        <w:t>: Temps réponse &lt; 2s pour recherches, traversées graphes optimisés</w:t>
       </w:r>
     </w:p>
     <w:p>
@@ -3724,7 +3927,13 @@
         </w:numPr>
       </w:pPr>
       <w:r>
-        <w:t xml:space="preserve">Sécurité : JWT </w:t>
+        <w:t>Sécurité</w:t>
+      </w:r>
+      <w:r>
+        <w:t xml:space="preserve"> </w:t>
+      </w:r>
+      <w:r>
+        <w:t xml:space="preserve">: JWT </w:t>
       </w:r>
       <w:proofErr w:type="spellStart"/>
       <w:r>
@@ -3751,7 +3960,13 @@
         </w:numPr>
       </w:pPr>
       <w:r>
-        <w:t>UX/UI : Interface intuitive, responsive mobile/desktop, cartes interactives fluides</w:t>
+        <w:t>UX/UI</w:t>
+      </w:r>
+      <w:r>
+        <w:t xml:space="preserve"> </w:t>
+      </w:r>
+      <w:r>
+        <w:t>: Interface intuitive, responsive mobile/desktop, cartes interactives fluides</w:t>
       </w:r>
     </w:p>
     <w:p>
@@ -3762,7 +3977,13 @@
         </w:numPr>
       </w:pPr>
       <w:r>
-        <w:t>Scalabilité : Architecture permettant passage Neo4j Cloud, gestion millions relations</w:t>
+        <w:t>Scalabilité</w:t>
+      </w:r>
+      <w:r>
+        <w:t xml:space="preserve"> </w:t>
+      </w:r>
+      <w:r>
+        <w:t>: Architecture permettant passage Neo4j Cloud, gestion millions relations</w:t>
       </w:r>
     </w:p>
     <w:p>
@@ -3786,7 +4007,19 @@
         <w:rPr>
           <w:lang w:val="en-US"/>
         </w:rPr>
-        <w:t>safety :</w:t>
+        <w:t>safety</w:t>
+      </w:r>
+      <w:r>
+        <w:rPr>
+          <w:lang w:val="en-US"/>
+        </w:rPr>
+        <w:t xml:space="preserve"> </w:t>
+      </w:r>
+      <w:r>
+        <w:rPr>
+          <w:lang w:val="en-US"/>
+        </w:rPr>
+        <w:t>:</w:t>
       </w:r>
       <w:proofErr w:type="gramEnd"/>
       <w:r>
@@ -3818,7 +4051,13 @@
         </w:numPr>
       </w:pPr>
       <w:r>
-        <w:t xml:space="preserve">Fiabilité : Gestion erreurs robuste, cache Apollo Client, </w:t>
+        <w:t>Fiabilité</w:t>
+      </w:r>
+      <w:r>
+        <w:t xml:space="preserve"> </w:t>
+      </w:r>
+      <w:r>
+        <w:t xml:space="preserve">: Gestion erreurs robuste, cache Apollo Client, </w:t>
       </w:r>
       <w:proofErr w:type="spellStart"/>
       <w:r>
@@ -3826,7 +4065,7 @@
       </w:r>
       <w:proofErr w:type="spellEnd"/>
       <w:r>
-        <w:t xml:space="preserve"> automatique​</w:t>
+        <w:t xml:space="preserve"> automatique</w:t>
       </w:r>
     </w:p>
     <w:p>
@@ -3919,7 +4158,7 @@
         </w:numPr>
       </w:pPr>
       <w:r>
-        <w:t>Git/GitHub : Version control + collaboration​</w:t>
+        <w:t>Git/GitHub : Version control + collaboration</w:t>
       </w:r>
     </w:p>
     <w:p>
@@ -3944,14 +4183,12 @@
           <w:lang w:val="en-US"/>
         </w:rPr>
       </w:pPr>
-      <w:proofErr w:type="gramStart"/>
       <w:r>
         <w:rPr>
           <w:lang w:val="en-US"/>
         </w:rPr>
-        <w:t>Backend :</w:t>
-      </w:r>
-      <w:proofErr w:type="gramEnd"/>
+        <w:t>Backend:</w:t>
+      </w:r>
       <w:r>
         <w:rPr>
           <w:lang w:val="en-US"/>
@@ -4027,7 +4264,7 @@
         </w:numPr>
       </w:pPr>
       <w:r>
-        <w:t>Monitoring : Logs centralisés, métriques performance​</w:t>
+        <w:t>Monitoring : Logs centralisés, métriques performance</w:t>
       </w:r>
     </w:p>
     <w:p>
@@ -4375,7 +4612,10 @@
     </w:p>
     <w:p>
       <w:r>
-        <w:t>Le projet </w:t>
+        <w:t>Le projet</w:t>
+      </w:r>
+      <w:r>
+        <w:t xml:space="preserve"> </w:t>
       </w:r>
       <w:proofErr w:type="spellStart"/>
       <w:r>
@@ -4383,7 +4623,10 @@
       </w:r>
       <w:proofErr w:type="spellEnd"/>
       <w:r>
-        <w:t> représente une approche innovante de la recommandation immobilière en exploitant la puissance des bases de données orientées graphes Neo4j pour modéliser les relations complexes entre utilisateurs, propriétés et localisations. Cette architecture garantit une application scalable, maintenable et offrant une excellente expérience utilisateur.</w:t>
+        <w:t xml:space="preserve"> </w:t>
+      </w:r>
+      <w:r>
+        <w:t>représente une approche innovante de la recommandation immobilière en exploitant la puissance des bases de données orientées graphes Neo4j pour modéliser les relations complexes entre utilisateurs, propriétés et localisations. Cette architecture garantit une application scalable, maintenable et offrant une excellente expérience utilisateur.</w:t>
       </w:r>
     </w:p>
     <w:p/>

</xml_diff>

<commit_message>
Neo4j Graph Database Arrows Modeling
</commit_message>
<xml_diff>
--- a/Documentation/CAHIER DES CHARGES - GRAPHIMMO.docx
+++ b/Documentation/CAHIER DES CHARGES - GRAPHIMMO.docx
@@ -56,15 +56,7 @@
     </w:p>
     <w:p>
       <w:r>
-        <w:t xml:space="preserve">Le projet </w:t>
-      </w:r>
-      <w:proofErr w:type="spellStart"/>
-      <w:r>
-        <w:t>GraphImmo</w:t>
-      </w:r>
-      <w:proofErr w:type="spellEnd"/>
-      <w:r>
-        <w:t xml:space="preserve"> vise à développer</w:t>
+        <w:t>Le projet GraphImmo vise à développer</w:t>
       </w:r>
       <w:r>
         <w:t xml:space="preserve"> </w:t>
@@ -76,15 +68,7 @@
         <w:t xml:space="preserve"> </w:t>
       </w:r>
       <w:r>
-        <w:t xml:space="preserve">de recommandation immobilière intelligente exploitant les bases de données orientées graphes (Neo4j) pour gérer les relations complexes entre propriétés, utilisateurs et agences. L'application permet aux visiteurs de rechercher, filtrer et consulter des biens immobiliers sans création de compte, tout en offrant des fonctionnalités avancées (favoris, </w:t>
-      </w:r>
-      <w:proofErr w:type="spellStart"/>
-      <w:r>
-        <w:t>matching</w:t>
-      </w:r>
-      <w:proofErr w:type="spellEnd"/>
-      <w:r>
-        <w:t>, recommandations personnalisées, demandes de visite) aux utilisateurs connectés. L'objectif est d'améliorer l'expérience utilisateur grâce à des recommandations intelligentes basées sur les relations graphiques, la géolocalisation et des algorithmes d'apprentissage.</w:t>
+        <w:t>de recommandation immobilière intelligente exploitant les bases de données orientées graphes (Neo4j) pour gérer les relations complexes entre propriétés, utilisateurs et agences. L'application permet aux visiteurs de rechercher, filtrer et consulter des biens immobiliers sans création de compte, tout en offrant des fonctionnalités avancées (favoris, matching, recommandations personnalisées, demandes de visite) aux utilisateurs connectés. L'objectif est d'améliorer l'expérience utilisateur grâce à des recommandations intelligentes basées sur les relations graphiques, la géolocalisation et des algorithmes d'apprentissage.</w:t>
       </w:r>
       <w:r>
         <w:t xml:space="preserve"> </w:t>
@@ -161,13 +145,8 @@
       <w:r>
         <w:t xml:space="preserve"> </w:t>
       </w:r>
-      <w:proofErr w:type="spellStart"/>
-      <w:r>
-        <w:t>matching</w:t>
-      </w:r>
-      <w:proofErr w:type="spellEnd"/>
-      <w:r>
-        <w:t xml:space="preserve"> automatique</w:t>
+      <w:r>
+        <w:t>matching automatique</w:t>
       </w:r>
       <w:r>
         <w:t xml:space="preserve"> </w:t>
@@ -265,15 +244,7 @@
         <w:t xml:space="preserve"> </w:t>
       </w:r>
       <w:r>
-        <w:t xml:space="preserve">des statistiques et </w:t>
-      </w:r>
-      <w:proofErr w:type="spellStart"/>
-      <w:r>
-        <w:t>analytics</w:t>
-      </w:r>
-      <w:proofErr w:type="spellEnd"/>
-      <w:r>
-        <w:t xml:space="preserve"> avancés.</w:t>
+        <w:t>des statistiques et analytics avancés.</w:t>
       </w:r>
     </w:p>
     <w:p>
@@ -501,13 +472,8 @@
           <w:numId w:val="5"/>
         </w:numPr>
       </w:pPr>
-      <w:proofErr w:type="spellStart"/>
-      <w:r>
-        <w:t>Ranking</w:t>
-      </w:r>
-      <w:proofErr w:type="spellEnd"/>
-      <w:r>
-        <w:t xml:space="preserve"> Neo4j GDS (PageRank, détection communautés)</w:t>
+      <w:r>
+        <w:t>Ranking Neo4j GDS (PageRank, détection communautés)</w:t>
       </w:r>
     </w:p>
     <w:p>
@@ -530,40 +496,46 @@
         </w:rPr>
       </w:pPr>
       <w:r>
-        <w:t>3.5. Matching utilisateur-propriété (CONNECTÉ)</w:t>
+        <w:t>3.</w:t>
+      </w:r>
+      <w:r>
+        <w:t>5</w:t>
+      </w:r>
+      <w:r>
+        <w:t>. Gestion favoris et historique (CONNECTÉ)</w:t>
       </w:r>
     </w:p>
     <w:p>
       <w:pPr>
         <w:numPr>
           <w:ilvl w:val="0"/>
-          <w:numId w:val="6"/>
+          <w:numId w:val="7"/>
         </w:numPr>
       </w:pPr>
       <w:r>
-        <w:t>Calcul score compatibilité (budget, surface, localisation, équipements)</w:t>
+        <w:t>Ajout/retrait propriétés favorites (relation AIME)</w:t>
       </w:r>
     </w:p>
     <w:p>
       <w:pPr>
         <w:numPr>
           <w:ilvl w:val="0"/>
-          <w:numId w:val="6"/>
+          <w:numId w:val="7"/>
         </w:numPr>
       </w:pPr>
       <w:r>
-        <w:t>Affichage pourcentage match</w:t>
+        <w:t>Historique consultations (relation VISITE)</w:t>
       </w:r>
     </w:p>
     <w:p>
       <w:pPr>
         <w:numPr>
           <w:ilvl w:val="0"/>
-          <w:numId w:val="6"/>
+          <w:numId w:val="7"/>
         </w:numPr>
       </w:pPr>
       <w:r>
-        <w:t>Suggestions automatiques propriétés compatibles</w:t>
+        <w:t>Dashboard personnel</w:t>
       </w:r>
     </w:p>
     <w:p>
@@ -575,40 +547,57 @@
         </w:rPr>
       </w:pPr>
       <w:r>
-        <w:t>3.6. Gestion favoris et historique (CONNECTÉ)</w:t>
+        <w:t>3.</w:t>
+      </w:r>
+      <w:r>
+        <w:t>6</w:t>
+      </w:r>
+      <w:r>
+        <w:t>. Demande de visite (CONNECTÉ)</w:t>
       </w:r>
     </w:p>
     <w:p>
       <w:pPr>
         <w:numPr>
           <w:ilvl w:val="0"/>
-          <w:numId w:val="7"/>
+          <w:numId w:val="8"/>
         </w:numPr>
       </w:pPr>
       <w:r>
-        <w:t>Ajout/retrait propriétés favorites (relation AIME)</w:t>
+        <w:t>Formulaire demande avec date/heure souhaitée</w:t>
       </w:r>
     </w:p>
     <w:p>
       <w:pPr>
         <w:numPr>
           <w:ilvl w:val="0"/>
-          <w:numId w:val="7"/>
+          <w:numId w:val="8"/>
         </w:numPr>
       </w:pPr>
       <w:r>
-        <w:t>Historique consultations (relation VISITE)</w:t>
+        <w:t>Suivi statut (en_attente, acceptée, refusée)</w:t>
       </w:r>
     </w:p>
     <w:p>
       <w:pPr>
         <w:numPr>
           <w:ilvl w:val="0"/>
-          <w:numId w:val="7"/>
+          <w:numId w:val="8"/>
         </w:numPr>
       </w:pPr>
       <w:r>
-        <w:t>Dashboard personnel</w:t>
+        <w:t>Notification agent immobilier</w:t>
+      </w:r>
+    </w:p>
+    <w:p>
+      <w:pPr>
+        <w:numPr>
+          <w:ilvl w:val="0"/>
+          <w:numId w:val="8"/>
+        </w:numPr>
+      </w:pPr>
+      <w:r>
+        <w:t>Historique demandes</w:t>
       </w:r>
     </w:p>
     <w:p>
@@ -620,59 +609,46 @@
         </w:rPr>
       </w:pPr>
       <w:r>
-        <w:t>3.7. Demande de visite (CONNECTÉ)</w:t>
+        <w:t>3.</w:t>
+      </w:r>
+      <w:r>
+        <w:t>7</w:t>
+      </w:r>
+      <w:r>
+        <w:t>. Comparaison propriétés (ANONYME)</w:t>
       </w:r>
     </w:p>
     <w:p>
       <w:pPr>
         <w:numPr>
           <w:ilvl w:val="0"/>
-          <w:numId w:val="8"/>
+          <w:numId w:val="9"/>
         </w:numPr>
       </w:pPr>
       <w:r>
-        <w:t>Formulaire demande avec date/heure souhaitée</w:t>
+        <w:t>Sélection jusqu'à 3 propriétés</w:t>
       </w:r>
     </w:p>
     <w:p>
       <w:pPr>
         <w:numPr>
           <w:ilvl w:val="0"/>
-          <w:numId w:val="8"/>
+          <w:numId w:val="9"/>
         </w:numPr>
       </w:pPr>
       <w:r>
-        <w:t>Suivi statut (</w:t>
-      </w:r>
-      <w:proofErr w:type="spellStart"/>
-      <w:r>
-        <w:t>en_attente</w:t>
-      </w:r>
-      <w:proofErr w:type="spellEnd"/>
-      <w:r>
-        <w:t>, acceptée, refusée)</w:t>
+        <w:t>Tableau comparatif côte-à-côte (prix, surface, chambres, équipements)</w:t>
       </w:r>
     </w:p>
     <w:p>
       <w:pPr>
         <w:numPr>
           <w:ilvl w:val="0"/>
-          <w:numId w:val="8"/>
+          <w:numId w:val="9"/>
         </w:numPr>
       </w:pPr>
       <w:r>
-        <w:t>Notification agent immobilier</w:t>
-      </w:r>
-    </w:p>
-    <w:p>
-      <w:pPr>
-        <w:numPr>
-          <w:ilvl w:val="0"/>
-          <w:numId w:val="8"/>
-        </w:numPr>
-      </w:pPr>
-      <w:r>
-        <w:t>Historique demandes</w:t>
+        <w:t>Suggestions propriétés similaires</w:t>
       </w:r>
     </w:p>
     <w:p>
@@ -684,53 +660,13 @@
         </w:rPr>
       </w:pPr>
       <w:r>
-        <w:t>3.8. Comparaison propriétés (ANONYME)</w:t>
-      </w:r>
-    </w:p>
-    <w:p>
-      <w:pPr>
-        <w:numPr>
-          <w:ilvl w:val="0"/>
-          <w:numId w:val="9"/>
-        </w:numPr>
-      </w:pPr>
-      <w:r>
-        <w:t>Sélection jusqu'à 3 propriétés</w:t>
-      </w:r>
-    </w:p>
-    <w:p>
-      <w:pPr>
-        <w:numPr>
-          <w:ilvl w:val="0"/>
-          <w:numId w:val="9"/>
-        </w:numPr>
-      </w:pPr>
-      <w:r>
-        <w:t>Tableau comparatif côte-à-côte (prix, surface, chambres, équipements)</w:t>
-      </w:r>
-    </w:p>
-    <w:p>
-      <w:pPr>
-        <w:numPr>
-          <w:ilvl w:val="0"/>
-          <w:numId w:val="9"/>
-        </w:numPr>
-      </w:pPr>
-      <w:r>
-        <w:lastRenderedPageBreak/>
-        <w:t>Suggestions propriétés similaires</w:t>
-      </w:r>
-    </w:p>
-    <w:p>
-      <w:pPr>
-        <w:pStyle w:val="Titre2"/>
-        <w:rPr>
-          <w:b/>
-          <w:bCs/>
-        </w:rPr>
-      </w:pPr>
-      <w:r>
-        <w:t>3.9. Notifications et alertes (CONNECTÉ)</w:t>
+        <w:t>3.</w:t>
+      </w:r>
+      <w:r>
+        <w:t>8</w:t>
+      </w:r>
+      <w:r>
+        <w:t>. Notifications et alertes (CONNECTÉ)</w:t>
       </w:r>
     </w:p>
     <w:p>
@@ -763,6 +699,7 @@
         </w:numPr>
       </w:pPr>
       <w:r>
+        <w:lastRenderedPageBreak/>
         <w:t>Alertes réponse demande visite</w:t>
       </w:r>
     </w:p>
@@ -792,7 +729,13 @@
         </w:rPr>
       </w:pPr>
       <w:r>
-        <w:t>3.10. Analytics agents (CONNECTÉ AGENTS)</w:t>
+        <w:t>3.</w:t>
+      </w:r>
+      <w:r>
+        <w:t>9</w:t>
+      </w:r>
+      <w:r>
+        <w:t>. Analytics agents (CONNECTÉ AGENTS)</w:t>
       </w:r>
     </w:p>
     <w:p>
@@ -877,15 +820,7 @@
         <w:t xml:space="preserve"> </w:t>
       </w:r>
       <w:r>
-        <w:t>: Python FastAPI (</w:t>
-      </w:r>
-      <w:proofErr w:type="spellStart"/>
-      <w:r>
-        <w:t>async</w:t>
-      </w:r>
-      <w:proofErr w:type="spellEnd"/>
-      <w:r>
-        <w:t>, haute performance)</w:t>
+        <w:t>: Python FastAPI (async, haute performance)</w:t>
       </w:r>
     </w:p>
     <w:p>
@@ -919,23 +854,7 @@
         <w:t xml:space="preserve"> </w:t>
       </w:r>
       <w:r>
-        <w:t>: GraphQL (</w:t>
-      </w:r>
-      <w:proofErr w:type="spellStart"/>
-      <w:r>
-        <w:t>Strawberry</w:t>
-      </w:r>
-      <w:proofErr w:type="spellEnd"/>
-      <w:r>
-        <w:t>/</w:t>
-      </w:r>
-      <w:proofErr w:type="spellStart"/>
-      <w:r>
-        <w:t>Ariadne</w:t>
-      </w:r>
-      <w:proofErr w:type="spellEnd"/>
-      <w:r>
-        <w:t>) pour requêtes flexibles</w:t>
+        <w:t>: GraphQL (Strawberry/Ariadne) pour requêtes flexibles</w:t>
       </w:r>
     </w:p>
     <w:p>
@@ -986,21 +905,8 @@
         <w:t xml:space="preserve"> </w:t>
       </w:r>
       <w:r>
-        <w:t xml:space="preserve">: </w:t>
-      </w:r>
-      <w:proofErr w:type="spellStart"/>
-      <w:r>
-        <w:t>Pydantic</w:t>
-      </w:r>
-      <w:proofErr w:type="spellEnd"/>
-      <w:r>
-        <w:t xml:space="preserve"> pour type-</w:t>
-      </w:r>
-      <w:proofErr w:type="spellStart"/>
-      <w:r>
-        <w:t>safe</w:t>
-      </w:r>
-      <w:proofErr w:type="spellEnd"/>
+        <w:t>: Pydantic pour type-safe</w:t>
+      </w:r>
     </w:p>
     <w:p>
       <w:pPr>
@@ -1028,21 +934,8 @@
         <w:t xml:space="preserve"> </w:t>
       </w:r>
       <w:r>
-        <w:t xml:space="preserve">: </w:t>
-      </w:r>
-      <w:proofErr w:type="spellStart"/>
-      <w:r>
-        <w:t>React</w:t>
-      </w:r>
-      <w:proofErr w:type="spellEnd"/>
-      <w:r>
-        <w:t xml:space="preserve"> 18+ avec </w:t>
-      </w:r>
-      <w:proofErr w:type="spellStart"/>
-      <w:r>
-        <w:t>TypeScript</w:t>
-      </w:r>
-      <w:proofErr w:type="spellEnd"/>
+        <w:t>: React 18+ avec TypeScript</w:t>
+      </w:r>
     </w:p>
     <w:p>
       <w:pPr>
@@ -1092,21 +985,8 @@
         <w:t xml:space="preserve"> </w:t>
       </w:r>
       <w:r>
-        <w:t xml:space="preserve">: </w:t>
-      </w:r>
-      <w:proofErr w:type="spellStart"/>
-      <w:r>
-        <w:t>Material</w:t>
-      </w:r>
-      <w:proofErr w:type="spellEnd"/>
-      <w:r>
-        <w:t xml:space="preserve">-UI ou </w:t>
-      </w:r>
-      <w:proofErr w:type="spellStart"/>
-      <w:r>
-        <w:t>TailwindCSS</w:t>
-      </w:r>
-      <w:proofErr w:type="spellEnd"/>
+        <w:t>: Material-UI ou TailwindCSS</w:t>
+      </w:r>
     </w:p>
     <w:p>
       <w:pPr>
@@ -1115,19 +995,9 @@
           <w:numId w:val="13"/>
         </w:numPr>
       </w:pPr>
-      <w:proofErr w:type="spellStart"/>
-      <w:r>
-        <w:t>Build</w:t>
-      </w:r>
-      <w:proofErr w:type="spellEnd"/>
-      <w:r>
-        <w:t xml:space="preserve"> </w:t>
-      </w:r>
-      <w:proofErr w:type="spellStart"/>
-      <w:r>
-        <w:t>tool</w:t>
-      </w:r>
-      <w:proofErr w:type="spellEnd"/>
+      <w:r>
+        <w:t>Build tool</w:t>
+      </w:r>
       <w:r>
         <w:t xml:space="preserve"> </w:t>
       </w:r>
@@ -1149,15 +1019,7 @@
         <w:t xml:space="preserve"> </w:t>
       </w:r>
       <w:r>
-        <w:t xml:space="preserve">: Apollo Cache + </w:t>
-      </w:r>
-      <w:proofErr w:type="spellStart"/>
-      <w:r>
-        <w:t>Context</w:t>
-      </w:r>
-      <w:proofErr w:type="spellEnd"/>
-      <w:r>
-        <w:t xml:space="preserve"> AP</w:t>
+        <w:t>: Apollo Cache + Context AP</w:t>
       </w:r>
       <w:r>
         <w:t>I</w:t>
@@ -1189,13 +1051,8 @@
         <w:t xml:space="preserve"> </w:t>
       </w:r>
       <w:r>
-        <w:t xml:space="preserve">: </w:t>
-      </w:r>
-      <w:proofErr w:type="spellStart"/>
-      <w:r>
-        <w:t>Cypher</w:t>
-      </w:r>
-      <w:proofErr w:type="spellEnd"/>
+        <w:t>: Cypher</w:t>
+      </w:r>
     </w:p>
     <w:p>
       <w:pPr>
@@ -1222,7 +1079,6 @@
         </w:numPr>
       </w:pPr>
       <w:r>
-        <w:lastRenderedPageBreak/>
         <w:t>Modèle</w:t>
       </w:r>
       <w:r>
@@ -1292,6 +1148,7 @@
         <w:rPr>
           <w:lang w:val="en-US"/>
         </w:rPr>
+        <w:lastRenderedPageBreak/>
         <w:t>GraphQL subscriptions (WebSocket pour notifications real-time)</w:t>
       </w:r>
     </w:p>
@@ -1443,103 +1300,11 @@
                 <w:rFonts w:ascii="Calibri" w:hAnsi="Calibri" w:cs="Calibri"/>
               </w:rPr>
             </w:pPr>
-            <w:proofErr w:type="gramStart"/>
-            <w:r>
-              <w:rPr>
-                <w:rFonts w:ascii="Calibri" w:hAnsi="Calibri" w:cs="Calibri"/>
-              </w:rPr>
-              <w:t>id</w:t>
-            </w:r>
-            <w:proofErr w:type="gramEnd"/>
-            <w:r>
-              <w:rPr>
-                <w:rFonts w:ascii="Calibri" w:hAnsi="Calibri" w:cs="Calibri"/>
-              </w:rPr>
-              <w:t xml:space="preserve">, nom, </w:t>
-            </w:r>
-            <w:proofErr w:type="spellStart"/>
-            <w:r>
-              <w:rPr>
-                <w:rFonts w:ascii="Calibri" w:hAnsi="Calibri" w:cs="Calibri"/>
-              </w:rPr>
-              <w:t>prenom</w:t>
-            </w:r>
-            <w:proofErr w:type="spellEnd"/>
-            <w:r>
-              <w:rPr>
-                <w:rFonts w:ascii="Calibri" w:hAnsi="Calibri" w:cs="Calibri"/>
-              </w:rPr>
-              <w:t xml:space="preserve">, </w:t>
-            </w:r>
-            <w:proofErr w:type="gramStart"/>
-            <w:r>
-              <w:rPr>
-                <w:rFonts w:ascii="Calibri" w:hAnsi="Calibri" w:cs="Calibri"/>
-              </w:rPr>
-              <w:t>email</w:t>
-            </w:r>
-            <w:proofErr w:type="gramEnd"/>
-            <w:r>
-              <w:rPr>
-                <w:rFonts w:ascii="Calibri" w:hAnsi="Calibri" w:cs="Calibri"/>
-              </w:rPr>
-              <w:t xml:space="preserve">, budget, </w:t>
-            </w:r>
-            <w:proofErr w:type="spellStart"/>
-            <w:r>
-              <w:rPr>
-                <w:rFonts w:ascii="Calibri" w:hAnsi="Calibri" w:cs="Calibri"/>
-              </w:rPr>
-              <w:t>preferences_location</w:t>
-            </w:r>
-            <w:proofErr w:type="spellEnd"/>
-            <w:r>
-              <w:rPr>
-                <w:rFonts w:ascii="Calibri" w:hAnsi="Calibri" w:cs="Calibri"/>
-              </w:rPr>
-              <w:t xml:space="preserve">, </w:t>
-            </w:r>
-            <w:proofErr w:type="spellStart"/>
-            <w:r>
-              <w:rPr>
-                <w:rFonts w:ascii="Calibri" w:hAnsi="Calibri" w:cs="Calibri"/>
-              </w:rPr>
-              <w:t>surface_min</w:t>
-            </w:r>
-            <w:proofErr w:type="spellEnd"/>
-            <w:r>
-              <w:rPr>
-                <w:rFonts w:ascii="Calibri" w:hAnsi="Calibri" w:cs="Calibri"/>
-              </w:rPr>
-              <w:t xml:space="preserve">, </w:t>
-            </w:r>
-            <w:proofErr w:type="spellStart"/>
-            <w:r>
-              <w:rPr>
-                <w:rFonts w:ascii="Calibri" w:hAnsi="Calibri" w:cs="Calibri"/>
-              </w:rPr>
-              <w:t>ville_</w:t>
-            </w:r>
-            <w:proofErr w:type="gramStart"/>
-            <w:r>
-              <w:rPr>
-                <w:rFonts w:ascii="Calibri" w:hAnsi="Calibri" w:cs="Calibri"/>
-              </w:rPr>
-              <w:t>prefs</w:t>
-            </w:r>
-            <w:proofErr w:type="spellEnd"/>
-            <w:r>
-              <w:rPr>
-                <w:rFonts w:ascii="Calibri" w:hAnsi="Calibri" w:cs="Calibri"/>
-              </w:rPr>
-              <w:t>[</w:t>
-            </w:r>
-            <w:proofErr w:type="gramEnd"/>
-            <w:r>
-              <w:rPr>
-                <w:rFonts w:ascii="Calibri" w:hAnsi="Calibri" w:cs="Calibri"/>
-              </w:rPr>
-              <w:t>]</w:t>
+            <w:r>
+              <w:rPr>
+                <w:rFonts w:ascii="Calibri" w:hAnsi="Calibri" w:cs="Calibri"/>
+              </w:rPr>
+              <w:t>id, nom, prenom, email, budget, preferences_location, surface_min, ville_prefs[]</w:t>
             </w:r>
           </w:p>
         </w:tc>
@@ -1579,14 +1344,12 @@
                 <w:rFonts w:ascii="Calibri" w:hAnsi="Calibri" w:cs="Calibri"/>
               </w:rPr>
             </w:pPr>
-            <w:proofErr w:type="spellStart"/>
             <w:r>
               <w:rPr>
                 <w:rFonts w:ascii="Calibri" w:hAnsi="Calibri" w:cs="Calibri"/>
               </w:rPr>
               <w:t>Propriete</w:t>
             </w:r>
-            <w:proofErr w:type="spellEnd"/>
           </w:p>
         </w:tc>
         <w:tc>
@@ -1602,49 +1365,11 @@
                 <w:rFonts w:ascii="Calibri" w:hAnsi="Calibri" w:cs="Calibri"/>
               </w:rPr>
             </w:pPr>
-            <w:proofErr w:type="gramStart"/>
-            <w:r>
-              <w:rPr>
-                <w:rFonts w:ascii="Calibri" w:hAnsi="Calibri" w:cs="Calibri"/>
-              </w:rPr>
-              <w:t>id</w:t>
-            </w:r>
-            <w:proofErr w:type="gramEnd"/>
-            <w:r>
-              <w:rPr>
-                <w:rFonts w:ascii="Calibri" w:hAnsi="Calibri" w:cs="Calibri"/>
-              </w:rPr>
-              <w:t xml:space="preserve">, titre, description, prix, surface, chambres, adresse, </w:t>
-            </w:r>
-            <w:proofErr w:type="spellStart"/>
-            <w:r>
-              <w:rPr>
-                <w:rFonts w:ascii="Calibri" w:hAnsi="Calibri" w:cs="Calibri"/>
-              </w:rPr>
-              <w:t>geo</w:t>
-            </w:r>
-            <w:proofErr w:type="spellEnd"/>
-            <w:r>
-              <w:rPr>
-                <w:rFonts w:ascii="Calibri" w:hAnsi="Calibri" w:cs="Calibri"/>
-              </w:rPr>
-              <w:t>[</w:t>
-            </w:r>
-            <w:proofErr w:type="spellStart"/>
-            <w:proofErr w:type="gramStart"/>
-            <w:r>
-              <w:rPr>
-                <w:rFonts w:ascii="Calibri" w:hAnsi="Calibri" w:cs="Calibri"/>
-              </w:rPr>
-              <w:t>lat,lon</w:t>
-            </w:r>
-            <w:proofErr w:type="spellEnd"/>
-            <w:proofErr w:type="gramEnd"/>
-            <w:r>
-              <w:rPr>
-                <w:rFonts w:ascii="Calibri" w:hAnsi="Calibri" w:cs="Calibri"/>
-              </w:rPr>
-              <w:t>]</w:t>
+            <w:r>
+              <w:rPr>
+                <w:rFonts w:ascii="Calibri" w:hAnsi="Calibri" w:cs="Calibri"/>
+              </w:rPr>
+              <w:t>id, titre, description, prix, surface, chambres, adresse, geo[lat,lon]</w:t>
             </w:r>
           </w:p>
         </w:tc>
@@ -1708,47 +1433,11 @@
                 <w:rFonts w:ascii="Calibri" w:hAnsi="Calibri" w:cs="Calibri"/>
               </w:rPr>
             </w:pPr>
-            <w:proofErr w:type="gramStart"/>
-            <w:r>
-              <w:rPr>
-                <w:rFonts w:ascii="Calibri" w:hAnsi="Calibri" w:cs="Calibri"/>
-              </w:rPr>
-              <w:t>id</w:t>
-            </w:r>
-            <w:proofErr w:type="gramEnd"/>
-            <w:r>
-              <w:rPr>
-                <w:rFonts w:ascii="Calibri" w:hAnsi="Calibri" w:cs="Calibri"/>
-              </w:rPr>
-              <w:t xml:space="preserve">, nom, </w:t>
-            </w:r>
-            <w:proofErr w:type="spellStart"/>
-            <w:r>
-              <w:rPr>
-                <w:rFonts w:ascii="Calibri" w:hAnsi="Calibri" w:cs="Calibri"/>
-              </w:rPr>
-              <w:t>telephone</w:t>
-            </w:r>
-            <w:proofErr w:type="spellEnd"/>
-            <w:r>
-              <w:rPr>
-                <w:rFonts w:ascii="Calibri" w:hAnsi="Calibri" w:cs="Calibri"/>
-              </w:rPr>
-              <w:t xml:space="preserve">, </w:t>
-            </w:r>
-            <w:proofErr w:type="gramStart"/>
-            <w:r>
-              <w:rPr>
-                <w:rFonts w:ascii="Calibri" w:hAnsi="Calibri" w:cs="Calibri"/>
-              </w:rPr>
-              <w:t>email</w:t>
-            </w:r>
-            <w:proofErr w:type="gramEnd"/>
-            <w:r>
-              <w:rPr>
-                <w:rFonts w:ascii="Calibri" w:hAnsi="Calibri" w:cs="Calibri"/>
-              </w:rPr>
-              <w:t>, adresse</w:t>
+            <w:r>
+              <w:rPr>
+                <w:rFonts w:ascii="Calibri" w:hAnsi="Calibri" w:cs="Calibri"/>
+              </w:rPr>
+              <w:t>id, nom, telephone, email, adresse</w:t>
             </w:r>
           </w:p>
         </w:tc>
@@ -1809,42 +1498,12 @@
                 <w:rFonts w:ascii="Calibri" w:hAnsi="Calibri" w:cs="Calibri"/>
               </w:rPr>
             </w:pPr>
-            <w:proofErr w:type="gramStart"/>
-            <w:r>
-              <w:rPr>
-                <w:rFonts w:ascii="Calibri" w:hAnsi="Calibri" w:cs="Calibri"/>
-              </w:rPr>
-              <w:t>latitude</w:t>
-            </w:r>
-            <w:proofErr w:type="gramEnd"/>
-            <w:r>
-              <w:rPr>
-                <w:rFonts w:ascii="Calibri" w:hAnsi="Calibri" w:cs="Calibri"/>
-              </w:rPr>
-              <w:t xml:space="preserve">, longitude, commune, </w:t>
-            </w:r>
-            <w:proofErr w:type="spellStart"/>
-            <w:r>
-              <w:rPr>
-                <w:rFonts w:ascii="Calibri" w:hAnsi="Calibri" w:cs="Calibri"/>
-              </w:rPr>
-              <w:t>region</w:t>
-            </w:r>
-            <w:proofErr w:type="spellEnd"/>
-            <w:r>
-              <w:rPr>
-                <w:rFonts w:ascii="Calibri" w:hAnsi="Calibri" w:cs="Calibri"/>
-              </w:rPr>
-              <w:t xml:space="preserve">, prix_m2, </w:t>
-            </w:r>
-            <w:proofErr w:type="spellStart"/>
-            <w:r>
-              <w:rPr>
-                <w:rFonts w:ascii="Calibri" w:hAnsi="Calibri" w:cs="Calibri"/>
-              </w:rPr>
-              <w:t>securite</w:t>
-            </w:r>
-            <w:proofErr w:type="spellEnd"/>
+            <w:r>
+              <w:rPr>
+                <w:rFonts w:ascii="Calibri" w:hAnsi="Calibri" w:cs="Calibri"/>
+              </w:rPr>
+              <w:t>latitude, longitude, commune, region, prix_m2, securite</w:t>
+            </w:r>
           </w:p>
         </w:tc>
         <w:tc>
@@ -1907,36 +1566,12 @@
                 <w:rFonts w:ascii="Calibri" w:hAnsi="Calibri" w:cs="Calibri"/>
               </w:rPr>
             </w:pPr>
-            <w:proofErr w:type="spellStart"/>
-            <w:proofErr w:type="gramStart"/>
-            <w:r>
-              <w:rPr>
-                <w:rFonts w:ascii="Calibri" w:hAnsi="Calibri" w:cs="Calibri"/>
-              </w:rPr>
-              <w:t>date</w:t>
-            </w:r>
-            <w:proofErr w:type="gramEnd"/>
-            <w:r>
-              <w:rPr>
-                <w:rFonts w:ascii="Calibri" w:hAnsi="Calibri" w:cs="Calibri"/>
-              </w:rPr>
-              <w:t>_visite</w:t>
-            </w:r>
-            <w:proofErr w:type="spellEnd"/>
-            <w:r>
-              <w:rPr>
-                <w:rFonts w:ascii="Calibri" w:hAnsi="Calibri" w:cs="Calibri"/>
-              </w:rPr>
-              <w:t xml:space="preserve">, notes, </w:t>
-            </w:r>
-            <w:proofErr w:type="spellStart"/>
-            <w:r>
-              <w:rPr>
-                <w:rFonts w:ascii="Calibri" w:hAnsi="Calibri" w:cs="Calibri"/>
-              </w:rPr>
-              <w:t>prix_propose</w:t>
-            </w:r>
-            <w:proofErr w:type="spellEnd"/>
+            <w:r>
+              <w:rPr>
+                <w:rFonts w:ascii="Calibri" w:hAnsi="Calibri" w:cs="Calibri"/>
+              </w:rPr>
+              <w:t>date_visite, notes, prix_propose</w:t>
+            </w:r>
           </w:p>
         </w:tc>
         <w:tc>
@@ -1996,19 +1631,11 @@
                 <w:rFonts w:ascii="Calibri" w:hAnsi="Calibri" w:cs="Calibri"/>
               </w:rPr>
             </w:pPr>
-            <w:proofErr w:type="gramStart"/>
-            <w:r>
-              <w:rPr>
-                <w:rFonts w:ascii="Calibri" w:hAnsi="Calibri" w:cs="Calibri"/>
-              </w:rPr>
-              <w:t>id</w:t>
-            </w:r>
-            <w:proofErr w:type="gramEnd"/>
-            <w:r>
-              <w:rPr>
-                <w:rFonts w:ascii="Calibri" w:hAnsi="Calibri" w:cs="Calibri"/>
-              </w:rPr>
-              <w:t>, date, montant, statut</w:t>
+            <w:r>
+              <w:rPr>
+                <w:rFonts w:ascii="Calibri" w:hAnsi="Calibri" w:cs="Calibri"/>
+              </w:rPr>
+              <w:t>id, date, montant, statut</w:t>
             </w:r>
           </w:p>
         </w:tc>
@@ -2051,14 +1678,12 @@
                 <w:rFonts w:ascii="Calibri" w:hAnsi="Calibri" w:cs="Calibri"/>
               </w:rPr>
             </w:pPr>
-            <w:proofErr w:type="spellStart"/>
             <w:r>
               <w:rPr>
                 <w:rFonts w:ascii="Calibri" w:hAnsi="Calibri" w:cs="Calibri"/>
               </w:rPr>
               <w:t>Amenagement</w:t>
             </w:r>
-            <w:proofErr w:type="spellEnd"/>
           </w:p>
         </w:tc>
         <w:tc>
@@ -2074,42 +1699,12 @@
                 <w:rFonts w:ascii="Calibri" w:hAnsi="Calibri" w:cs="Calibri"/>
               </w:rPr>
             </w:pPr>
-            <w:proofErr w:type="gramStart"/>
-            <w:r>
-              <w:rPr>
-                <w:rFonts w:ascii="Calibri" w:hAnsi="Calibri" w:cs="Calibri"/>
-              </w:rPr>
-              <w:t>type</w:t>
-            </w:r>
-            <w:proofErr w:type="gramEnd"/>
-            <w:r>
-              <w:rPr>
-                <w:rFonts w:ascii="Calibri" w:hAnsi="Calibri" w:cs="Calibri"/>
-              </w:rPr>
-              <w:t>(</w:t>
-            </w:r>
-            <w:proofErr w:type="spellStart"/>
-            <w:r>
-              <w:rPr>
-                <w:rFonts w:ascii="Calibri" w:hAnsi="Calibri" w:cs="Calibri"/>
-              </w:rPr>
-              <w:t>piscine|garage</w:t>
-            </w:r>
-            <w:proofErr w:type="spellEnd"/>
-            <w:r>
-              <w:rPr>
-                <w:rFonts w:ascii="Calibri" w:hAnsi="Calibri" w:cs="Calibri"/>
-              </w:rPr>
-              <w:t xml:space="preserve">), </w:t>
-            </w:r>
-            <w:proofErr w:type="spellStart"/>
-            <w:r>
-              <w:rPr>
-                <w:rFonts w:ascii="Calibri" w:hAnsi="Calibri" w:cs="Calibri"/>
-              </w:rPr>
-              <w:t>qualite</w:t>
-            </w:r>
-            <w:proofErr w:type="spellEnd"/>
+            <w:r>
+              <w:rPr>
+                <w:rFonts w:ascii="Calibri" w:hAnsi="Calibri" w:cs="Calibri"/>
+              </w:rPr>
+              <w:t>type(piscine|garage), qualite</w:t>
+            </w:r>
           </w:p>
         </w:tc>
         <w:tc>
@@ -2169,78 +1764,12 @@
                 <w:rFonts w:ascii="Calibri" w:hAnsi="Calibri" w:cs="Calibri"/>
               </w:rPr>
             </w:pPr>
-            <w:proofErr w:type="gramStart"/>
             <w:r>
               <w:rPr>
                 <w:rFonts w:ascii="Calibri" w:hAnsi="Calibri" w:cs="Calibri"/>
                 <w:lang w:val="fr-FR"/>
               </w:rPr>
-              <w:t>url</w:t>
-            </w:r>
-            <w:proofErr w:type="gramEnd"/>
-            <w:r>
-              <w:rPr>
-                <w:rFonts w:ascii="Calibri" w:hAnsi="Calibri" w:cs="Calibri"/>
-                <w:lang w:val="fr-FR"/>
-              </w:rPr>
-              <w:t>, angle(</w:t>
-            </w:r>
-            <w:proofErr w:type="spellStart"/>
-            <w:r>
-              <w:rPr>
-                <w:rFonts w:ascii="Calibri" w:hAnsi="Calibri" w:cs="Calibri"/>
-                <w:lang w:val="fr-FR"/>
-              </w:rPr>
-              <w:t>facade|interieur|cuisine</w:t>
-            </w:r>
-            <w:proofErr w:type="spellEnd"/>
-            <w:r>
-              <w:rPr>
-                <w:rFonts w:ascii="Calibri" w:hAnsi="Calibri" w:cs="Calibri"/>
-                <w:lang w:val="fr-FR"/>
-              </w:rPr>
-              <w:t xml:space="preserve">), </w:t>
-            </w:r>
-            <w:proofErr w:type="spellStart"/>
-            <w:r>
-              <w:rPr>
-                <w:rFonts w:ascii="Calibri" w:hAnsi="Calibri" w:cs="Calibri"/>
-                <w:lang w:val="fr-FR"/>
-              </w:rPr>
-              <w:t>date_upload</w:t>
-            </w:r>
-            <w:proofErr w:type="spellEnd"/>
-            <w:r>
-              <w:rPr>
-                <w:rFonts w:ascii="Calibri" w:hAnsi="Calibri" w:cs="Calibri"/>
-                <w:lang w:val="fr-FR"/>
-              </w:rPr>
-              <w:t xml:space="preserve">, </w:t>
-            </w:r>
-            <w:proofErr w:type="spellStart"/>
-            <w:proofErr w:type="gramStart"/>
-            <w:r>
-              <w:rPr>
-                <w:rFonts w:ascii="Calibri" w:hAnsi="Calibri" w:cs="Calibri"/>
-                <w:lang w:val="fr-FR"/>
-              </w:rPr>
-              <w:t>qualite</w:t>
-            </w:r>
-            <w:proofErr w:type="spellEnd"/>
-            <w:r>
-              <w:rPr>
-                <w:rFonts w:ascii="Calibri" w:hAnsi="Calibri" w:cs="Calibri"/>
-                <w:lang w:val="fr-FR"/>
-              </w:rPr>
-              <w:t>(</w:t>
-            </w:r>
-            <w:proofErr w:type="gramEnd"/>
-            <w:r>
-              <w:rPr>
-                <w:rFonts w:ascii="Calibri" w:hAnsi="Calibri" w:cs="Calibri"/>
-                <w:lang w:val="fr-FR"/>
-              </w:rPr>
-              <w:t>HD|SD)</w:t>
+              <w:t>url, angle(facade|interieur|cuisine), date_upload, qualite(HD|SD)</w:t>
             </w:r>
           </w:p>
         </w:tc>
@@ -2409,7 +1938,6 @@
               <w:rPr>
                 <w:rFonts w:ascii="Calibri" w:hAnsi="Calibri" w:cs="Calibri"/>
               </w:rPr>
-              <w:lastRenderedPageBreak/>
               <w:t>AIME</w:t>
             </w:r>
           </w:p>
@@ -2431,16 +1959,8 @@
               <w:rPr>
                 <w:rFonts w:ascii="Calibri" w:hAnsi="Calibri" w:cs="Calibri"/>
               </w:rPr>
-              <w:t xml:space="preserve">User → </w:t>
-            </w:r>
-            <w:proofErr w:type="spellStart"/>
-            <w:r>
-              <w:rPr>
-                <w:rFonts w:ascii="Calibri" w:hAnsi="Calibri" w:cs="Calibri"/>
-              </w:rPr>
-              <w:t>Propriete</w:t>
-            </w:r>
-            <w:proofErr w:type="spellEnd"/>
+              <w:t>User → Propriete</w:t>
+            </w:r>
           </w:p>
         </w:tc>
         <w:tc>
@@ -2456,27 +1976,11 @@
                 <w:rFonts w:ascii="Calibri" w:hAnsi="Calibri" w:cs="Calibri"/>
               </w:rPr>
             </w:pPr>
-            <w:proofErr w:type="spellStart"/>
-            <w:proofErr w:type="gramStart"/>
-            <w:r>
-              <w:rPr>
-                <w:rFonts w:ascii="Calibri" w:hAnsi="Calibri" w:cs="Calibri"/>
-              </w:rPr>
-              <w:t>date</w:t>
-            </w:r>
-            <w:proofErr w:type="gramEnd"/>
-            <w:r>
-              <w:rPr>
-                <w:rFonts w:ascii="Calibri" w:hAnsi="Calibri" w:cs="Calibri"/>
-              </w:rPr>
-              <w:t>_ajout</w:t>
-            </w:r>
-            <w:proofErr w:type="spellEnd"/>
-            <w:r>
-              <w:rPr>
-                <w:rFonts w:ascii="Calibri" w:hAnsi="Calibri" w:cs="Calibri"/>
-              </w:rPr>
-              <w:t>, note</w:t>
+            <w:r>
+              <w:rPr>
+                <w:rFonts w:ascii="Calibri" w:hAnsi="Calibri" w:cs="Calibri"/>
+              </w:rPr>
+              <w:t>date_ajout, note</w:t>
             </w:r>
           </w:p>
         </w:tc>
@@ -2541,16 +2045,8 @@
               <w:rPr>
                 <w:rFonts w:ascii="Calibri" w:hAnsi="Calibri" w:cs="Calibri"/>
               </w:rPr>
-              <w:t xml:space="preserve">User → </w:t>
-            </w:r>
-            <w:proofErr w:type="spellStart"/>
-            <w:r>
-              <w:rPr>
-                <w:rFonts w:ascii="Calibri" w:hAnsi="Calibri" w:cs="Calibri"/>
-              </w:rPr>
-              <w:t>Propriete</w:t>
-            </w:r>
-            <w:proofErr w:type="spellEnd"/>
+              <w:t>User → Propriete</w:t>
+            </w:r>
           </w:p>
         </w:tc>
         <w:tc>
@@ -2566,19 +2062,11 @@
                 <w:rFonts w:ascii="Calibri" w:hAnsi="Calibri" w:cs="Calibri"/>
               </w:rPr>
             </w:pPr>
-            <w:proofErr w:type="gramStart"/>
-            <w:r>
-              <w:rPr>
-                <w:rFonts w:ascii="Calibri" w:hAnsi="Calibri" w:cs="Calibri"/>
-              </w:rPr>
-              <w:t>date</w:t>
-            </w:r>
-            <w:proofErr w:type="gramEnd"/>
-            <w:r>
-              <w:rPr>
-                <w:rFonts w:ascii="Calibri" w:hAnsi="Calibri" w:cs="Calibri"/>
-              </w:rPr>
-              <w:t>, impression</w:t>
+            <w:r>
+              <w:rPr>
+                <w:rFonts w:ascii="Calibri" w:hAnsi="Calibri" w:cs="Calibri"/>
+              </w:rPr>
+              <w:t>date, impression</w:t>
             </w:r>
           </w:p>
         </w:tc>
@@ -2646,16 +2134,8 @@
               <w:rPr>
                 <w:rFonts w:ascii="Calibri" w:hAnsi="Calibri" w:cs="Calibri"/>
               </w:rPr>
-              <w:t xml:space="preserve">Agence → </w:t>
-            </w:r>
-            <w:proofErr w:type="spellStart"/>
-            <w:r>
-              <w:rPr>
-                <w:rFonts w:ascii="Calibri" w:hAnsi="Calibri" w:cs="Calibri"/>
-              </w:rPr>
-              <w:t>Propriete</w:t>
-            </w:r>
-            <w:proofErr w:type="spellEnd"/>
+              <w:t>Agence → Propriete</w:t>
+            </w:r>
           </w:p>
         </w:tc>
         <w:tc>
@@ -2671,22 +2151,12 @@
                 <w:rFonts w:ascii="Calibri" w:hAnsi="Calibri" w:cs="Calibri"/>
               </w:rPr>
             </w:pPr>
-            <w:proofErr w:type="spellStart"/>
-            <w:proofErr w:type="gramStart"/>
-            <w:r>
-              <w:rPr>
-                <w:rFonts w:ascii="Calibri" w:hAnsi="Calibri" w:cs="Calibri"/>
-              </w:rPr>
-              <w:t>date</w:t>
-            </w:r>
-            <w:proofErr w:type="gramEnd"/>
-            <w:r>
-              <w:rPr>
-                <w:rFonts w:ascii="Calibri" w:hAnsi="Calibri" w:cs="Calibri"/>
-              </w:rPr>
-              <w:t>_depot</w:t>
-            </w:r>
-            <w:proofErr w:type="spellEnd"/>
+            <w:r>
+              <w:rPr>
+                <w:rFonts w:ascii="Calibri" w:hAnsi="Calibri" w:cs="Calibri"/>
+              </w:rPr>
+              <w:t>date_depot</w:t>
+            </w:r>
           </w:p>
         </w:tc>
         <w:tc>
@@ -2746,28 +2216,12 @@
                 <w:rFonts w:ascii="Calibri" w:hAnsi="Calibri" w:cs="Calibri"/>
               </w:rPr>
             </w:pPr>
-            <w:proofErr w:type="spellStart"/>
-            <w:r>
-              <w:rPr>
-                <w:rFonts w:ascii="Calibri" w:hAnsi="Calibri" w:cs="Calibri"/>
-              </w:rPr>
-              <w:t>Propriete</w:t>
-            </w:r>
-            <w:proofErr w:type="spellEnd"/>
-            <w:r>
-              <w:rPr>
-                <w:rFonts w:ascii="Calibri" w:hAnsi="Calibri" w:cs="Calibri"/>
-              </w:rPr>
-              <w:t xml:space="preserve"> → </w:t>
-            </w:r>
-            <w:proofErr w:type="spellStart"/>
-            <w:r>
-              <w:rPr>
-                <w:rFonts w:ascii="Calibri" w:hAnsi="Calibri" w:cs="Calibri"/>
-              </w:rPr>
-              <w:t>Propriete</w:t>
-            </w:r>
-            <w:proofErr w:type="spellEnd"/>
+            <w:r>
+              <w:rPr>
+                <w:rFonts w:ascii="Calibri" w:hAnsi="Calibri" w:cs="Calibri"/>
+              </w:rPr>
+              <w:t>Propriete → Propriete</w:t>
+            </w:r>
           </w:p>
         </w:tc>
         <w:tc>
@@ -2783,22 +2237,12 @@
                 <w:rFonts w:ascii="Calibri" w:hAnsi="Calibri" w:cs="Calibri"/>
               </w:rPr>
             </w:pPr>
-            <w:proofErr w:type="spellStart"/>
-            <w:proofErr w:type="gramStart"/>
-            <w:r>
-              <w:rPr>
-                <w:rFonts w:ascii="Calibri" w:hAnsi="Calibri" w:cs="Calibri"/>
-              </w:rPr>
-              <w:t>distance</w:t>
-            </w:r>
-            <w:proofErr w:type="gramEnd"/>
-            <w:r>
-              <w:rPr>
-                <w:rFonts w:ascii="Calibri" w:hAnsi="Calibri" w:cs="Calibri"/>
-              </w:rPr>
-              <w:t>_km</w:t>
-            </w:r>
-            <w:proofErr w:type="spellEnd"/>
+            <w:r>
+              <w:rPr>
+                <w:rFonts w:ascii="Calibri" w:hAnsi="Calibri" w:cs="Calibri"/>
+              </w:rPr>
+              <w:t>distance_km</w:t>
+            </w:r>
           </w:p>
         </w:tc>
         <w:tc>
@@ -2844,6 +2288,7 @@
               <w:rPr>
                 <w:rFonts w:ascii="Calibri" w:hAnsi="Calibri" w:cs="Calibri"/>
               </w:rPr>
+              <w:lastRenderedPageBreak/>
               <w:t>SIMILAIRE_A</w:t>
             </w:r>
           </w:p>
@@ -2861,28 +2306,12 @@
                 <w:rFonts w:ascii="Calibri" w:hAnsi="Calibri" w:cs="Calibri"/>
               </w:rPr>
             </w:pPr>
-            <w:proofErr w:type="spellStart"/>
-            <w:r>
-              <w:rPr>
-                <w:rFonts w:ascii="Calibri" w:hAnsi="Calibri" w:cs="Calibri"/>
-              </w:rPr>
-              <w:t>Propriete</w:t>
-            </w:r>
-            <w:proofErr w:type="spellEnd"/>
-            <w:r>
-              <w:rPr>
-                <w:rFonts w:ascii="Calibri" w:hAnsi="Calibri" w:cs="Calibri"/>
-              </w:rPr>
-              <w:t xml:space="preserve"> → </w:t>
-            </w:r>
-            <w:proofErr w:type="spellStart"/>
-            <w:r>
-              <w:rPr>
-                <w:rFonts w:ascii="Calibri" w:hAnsi="Calibri" w:cs="Calibri"/>
-              </w:rPr>
-              <w:t>Propriete</w:t>
-            </w:r>
-            <w:proofErr w:type="spellEnd"/>
+            <w:r>
+              <w:rPr>
+                <w:rFonts w:ascii="Calibri" w:hAnsi="Calibri" w:cs="Calibri"/>
+              </w:rPr>
+              <w:t>Propriete → Propriete</w:t>
+            </w:r>
           </w:p>
         </w:tc>
         <w:tc>
@@ -2898,22 +2327,12 @@
                 <w:rFonts w:ascii="Calibri" w:hAnsi="Calibri" w:cs="Calibri"/>
               </w:rPr>
             </w:pPr>
-            <w:proofErr w:type="spellStart"/>
-            <w:proofErr w:type="gramStart"/>
-            <w:r>
-              <w:rPr>
-                <w:rFonts w:ascii="Calibri" w:hAnsi="Calibri" w:cs="Calibri"/>
-              </w:rPr>
-              <w:t>score</w:t>
-            </w:r>
-            <w:proofErr w:type="gramEnd"/>
-            <w:r>
-              <w:rPr>
-                <w:rFonts w:ascii="Calibri" w:hAnsi="Calibri" w:cs="Calibri"/>
-              </w:rPr>
-              <w:t>_similarite</w:t>
-            </w:r>
-            <w:proofErr w:type="spellEnd"/>
+            <w:r>
+              <w:rPr>
+                <w:rFonts w:ascii="Calibri" w:hAnsi="Calibri" w:cs="Calibri"/>
+              </w:rPr>
+              <w:t>score_similarite</w:t>
+            </w:r>
           </w:p>
         </w:tc>
         <w:tc>
@@ -2994,16 +2413,12 @@
                 <w:rFonts w:ascii="Calibri" w:hAnsi="Calibri" w:cs="Calibri"/>
               </w:rPr>
             </w:pPr>
-            <w:proofErr w:type="spellStart"/>
-            <w:proofErr w:type="gramStart"/>
             <w:r>
               <w:rPr>
                 <w:rFonts w:ascii="Calibri" w:hAnsi="Calibri" w:cs="Calibri"/>
               </w:rPr>
               <w:t>priorite</w:t>
             </w:r>
-            <w:proofErr w:type="spellEnd"/>
-            <w:proofErr w:type="gramEnd"/>
           </w:p>
         </w:tc>
         <w:tc>
@@ -3066,19 +2481,11 @@
                 <w:rFonts w:ascii="Calibri" w:hAnsi="Calibri" w:cs="Calibri"/>
               </w:rPr>
             </w:pPr>
-            <w:proofErr w:type="spellStart"/>
-            <w:r>
-              <w:rPr>
-                <w:rFonts w:ascii="Calibri" w:hAnsi="Calibri" w:cs="Calibri"/>
-              </w:rPr>
-              <w:t>Propriete</w:t>
-            </w:r>
-            <w:proofErr w:type="spellEnd"/>
-            <w:r>
-              <w:rPr>
-                <w:rFonts w:ascii="Calibri" w:hAnsi="Calibri" w:cs="Calibri"/>
-              </w:rPr>
-              <w:t xml:space="preserve"> → User</w:t>
+            <w:r>
+              <w:rPr>
+                <w:rFonts w:ascii="Calibri" w:hAnsi="Calibri" w:cs="Calibri"/>
+              </w:rPr>
+              <w:t>Propriete → User</w:t>
             </w:r>
           </w:p>
         </w:tc>
@@ -3095,14 +2502,12 @@
                 <w:rFonts w:ascii="Calibri" w:hAnsi="Calibri" w:cs="Calibri"/>
               </w:rPr>
             </w:pPr>
-            <w:proofErr w:type="gramStart"/>
             <w:r>
               <w:rPr>
                 <w:rFonts w:ascii="Calibri" w:hAnsi="Calibri" w:cs="Calibri"/>
               </w:rPr>
               <w:t>score</w:t>
             </w:r>
-            <w:proofErr w:type="gramEnd"/>
           </w:p>
         </w:tc>
         <w:tc>
@@ -3162,19 +2567,11 @@
                 <w:rFonts w:ascii="Calibri" w:hAnsi="Calibri" w:cs="Calibri"/>
               </w:rPr>
             </w:pPr>
-            <w:proofErr w:type="spellStart"/>
-            <w:r>
-              <w:rPr>
-                <w:rFonts w:ascii="Calibri" w:hAnsi="Calibri" w:cs="Calibri"/>
-              </w:rPr>
-              <w:t>Propriete</w:t>
-            </w:r>
-            <w:proofErr w:type="spellEnd"/>
-            <w:r>
-              <w:rPr>
-                <w:rFonts w:ascii="Calibri" w:hAnsi="Calibri" w:cs="Calibri"/>
-              </w:rPr>
-              <w:t xml:space="preserve"> → Localisation</w:t>
+            <w:r>
+              <w:rPr>
+                <w:rFonts w:ascii="Calibri" w:hAnsi="Calibri" w:cs="Calibri"/>
+              </w:rPr>
+              <w:t>Propriete → Localisation</w:t>
             </w:r>
           </w:p>
         </w:tc>
@@ -3191,19 +2588,11 @@
                 <w:rFonts w:ascii="Calibri" w:hAnsi="Calibri" w:cs="Calibri"/>
               </w:rPr>
             </w:pPr>
-            <w:proofErr w:type="gramStart"/>
-            <w:r>
-              <w:rPr>
-                <w:rFonts w:ascii="Calibri" w:hAnsi="Calibri" w:cs="Calibri"/>
-              </w:rPr>
-              <w:t>prix</w:t>
-            </w:r>
-            <w:proofErr w:type="gramEnd"/>
-            <w:r>
-              <w:rPr>
-                <w:rFonts w:ascii="Calibri" w:hAnsi="Calibri" w:cs="Calibri"/>
-              </w:rPr>
-              <w:t>_m2_local</w:t>
+            <w:r>
+              <w:rPr>
+                <w:rFonts w:ascii="Calibri" w:hAnsi="Calibri" w:cs="Calibri"/>
+              </w:rPr>
+              <w:t>prix_m2_local</w:t>
             </w:r>
           </w:p>
         </w:tc>
@@ -3267,28 +2656,12 @@
                 <w:rFonts w:ascii="Calibri" w:hAnsi="Calibri" w:cs="Calibri"/>
               </w:rPr>
             </w:pPr>
-            <w:proofErr w:type="spellStart"/>
-            <w:r>
-              <w:rPr>
-                <w:rFonts w:ascii="Calibri" w:hAnsi="Calibri" w:cs="Calibri"/>
-              </w:rPr>
-              <w:t>Propriete</w:t>
-            </w:r>
-            <w:proofErr w:type="spellEnd"/>
-            <w:r>
-              <w:rPr>
-                <w:rFonts w:ascii="Calibri" w:hAnsi="Calibri" w:cs="Calibri"/>
-              </w:rPr>
-              <w:t xml:space="preserve"> → </w:t>
-            </w:r>
-            <w:proofErr w:type="spellStart"/>
-            <w:r>
-              <w:rPr>
-                <w:rFonts w:ascii="Calibri" w:hAnsi="Calibri" w:cs="Calibri"/>
-              </w:rPr>
-              <w:t>Amenagement</w:t>
-            </w:r>
-            <w:proofErr w:type="spellEnd"/>
+            <w:r>
+              <w:rPr>
+                <w:rFonts w:ascii="Calibri" w:hAnsi="Calibri" w:cs="Calibri"/>
+              </w:rPr>
+              <w:t>Propriete → Amenagement</w:t>
+            </w:r>
           </w:p>
         </w:tc>
         <w:tc>
@@ -3369,19 +2742,11 @@
                 <w:rFonts w:ascii="Calibri" w:hAnsi="Calibri" w:cs="Calibri"/>
               </w:rPr>
             </w:pPr>
-            <w:proofErr w:type="spellStart"/>
-            <w:r>
-              <w:rPr>
-                <w:rFonts w:ascii="Calibri" w:hAnsi="Calibri" w:cs="Calibri"/>
-              </w:rPr>
-              <w:t>Propriete</w:t>
-            </w:r>
-            <w:proofErr w:type="spellEnd"/>
-            <w:r>
-              <w:rPr>
-                <w:rFonts w:ascii="Calibri" w:hAnsi="Calibri" w:cs="Calibri"/>
-              </w:rPr>
-              <w:t xml:space="preserve"> → Photo</w:t>
+            <w:r>
+              <w:rPr>
+                <w:rFonts w:ascii="Calibri" w:hAnsi="Calibri" w:cs="Calibri"/>
+              </w:rPr>
+              <w:t>Propriete → Photo</w:t>
             </w:r>
           </w:p>
         </w:tc>
@@ -3564,14 +2929,12 @@
               </w:rPr>
               <w:t xml:space="preserve">User → </w:t>
             </w:r>
-            <w:proofErr w:type="spellStart"/>
             <w:r>
               <w:rPr>
                 <w:rFonts w:cstheme="minorHAnsi"/>
               </w:rPr>
               <w:t>Propriete</w:t>
             </w:r>
-            <w:proofErr w:type="spellEnd"/>
           </w:p>
         </w:tc>
         <w:tc>
@@ -3585,28 +2948,12 @@
                 <w:rFonts w:ascii="Calibri" w:hAnsi="Calibri" w:cs="Calibri"/>
               </w:rPr>
             </w:pPr>
-            <w:proofErr w:type="gramStart"/>
-            <w:r>
-              <w:rPr>
-                <w:rFonts w:ascii="Calibri" w:hAnsi="Calibri" w:cs="Calibri"/>
-              </w:rPr>
-              <w:t>type</w:t>
-            </w:r>
-            <w:proofErr w:type="gramEnd"/>
-            <w:r>
-              <w:rPr>
-                <w:rFonts w:ascii="Calibri" w:hAnsi="Calibri" w:cs="Calibri"/>
-              </w:rPr>
-              <w:t xml:space="preserve">, date, lu, message, </w:t>
-            </w:r>
-            <w:proofErr w:type="spellStart"/>
-            <w:r>
-              <w:rPr>
-                <w:rFonts w:ascii="Calibri" w:hAnsi="Calibri" w:cs="Calibri"/>
-              </w:rPr>
-              <w:t>propriete_id</w:t>
-            </w:r>
-            <w:proofErr w:type="spellEnd"/>
+            <w:r>
+              <w:rPr>
+                <w:rFonts w:ascii="Calibri" w:hAnsi="Calibri" w:cs="Calibri"/>
+              </w:rPr>
+              <w:t>type, date, lu, message, propriete_id</w:t>
+            </w:r>
           </w:p>
         </w:tc>
         <w:tc>
@@ -3680,14 +3027,12 @@
               </w:rPr>
               <w:t xml:space="preserve">User → </w:t>
             </w:r>
-            <w:proofErr w:type="spellStart"/>
             <w:r>
               <w:rPr>
                 <w:rFonts w:cstheme="minorHAnsi"/>
               </w:rPr>
               <w:t>Propriete</w:t>
             </w:r>
-            <w:proofErr w:type="spellEnd"/>
           </w:p>
         </w:tc>
         <w:tc>
@@ -3701,41 +3046,11 @@
                 <w:rFonts w:ascii="Calibri" w:hAnsi="Calibri" w:cs="Calibri"/>
               </w:rPr>
             </w:pPr>
-            <w:proofErr w:type="spellStart"/>
-            <w:proofErr w:type="gramStart"/>
-            <w:r>
-              <w:rPr>
-                <w:rFonts w:ascii="Calibri" w:hAnsi="Calibri" w:cs="Calibri"/>
-              </w:rPr>
-              <w:t>date</w:t>
-            </w:r>
-            <w:proofErr w:type="gramEnd"/>
-            <w:r>
-              <w:rPr>
-                <w:rFonts w:ascii="Calibri" w:hAnsi="Calibri" w:cs="Calibri"/>
-              </w:rPr>
-              <w:t>_souhaitee</w:t>
-            </w:r>
-            <w:proofErr w:type="spellEnd"/>
-            <w:r>
-              <w:rPr>
-                <w:rFonts w:ascii="Calibri" w:hAnsi="Calibri" w:cs="Calibri"/>
-              </w:rPr>
-              <w:t xml:space="preserve">, heure, statut, </w:t>
-            </w:r>
-            <w:proofErr w:type="spellStart"/>
-            <w:r>
-              <w:rPr>
-                <w:rFonts w:ascii="Calibri" w:hAnsi="Calibri" w:cs="Calibri"/>
-              </w:rPr>
-              <w:t>date_creation</w:t>
-            </w:r>
-            <w:proofErr w:type="spellEnd"/>
-            <w:r>
-              <w:rPr>
-                <w:rFonts w:ascii="Calibri" w:hAnsi="Calibri" w:cs="Calibri"/>
-              </w:rPr>
-              <w:t>, message</w:t>
+            <w:r>
+              <w:rPr>
+                <w:rFonts w:ascii="Calibri" w:hAnsi="Calibri" w:cs="Calibri"/>
+              </w:rPr>
+              <w:t>date_souhaitee, heure, statut, date_creation, message</w:t>
             </w:r>
           </w:p>
         </w:tc>
@@ -3794,28 +3109,12 @@
                 <w:rFonts w:ascii="Calibri" w:hAnsi="Calibri" w:cs="Calibri"/>
               </w:rPr>
             </w:pPr>
-            <w:proofErr w:type="spellStart"/>
-            <w:r>
-              <w:rPr>
-                <w:rFonts w:ascii="Calibri" w:hAnsi="Calibri" w:cs="Calibri"/>
-              </w:rPr>
-              <w:t>Propriete</w:t>
-            </w:r>
-            <w:proofErr w:type="spellEnd"/>
-            <w:r>
-              <w:rPr>
-                <w:rFonts w:ascii="Calibri" w:hAnsi="Calibri" w:cs="Calibri"/>
-              </w:rPr>
-              <w:t xml:space="preserve"> → </w:t>
-            </w:r>
-            <w:proofErr w:type="spellStart"/>
-            <w:r>
-              <w:rPr>
-                <w:rFonts w:ascii="Calibri" w:hAnsi="Calibri" w:cs="Calibri"/>
-              </w:rPr>
-              <w:t>Propriete</w:t>
-            </w:r>
-            <w:proofErr w:type="spellEnd"/>
+            <w:r>
+              <w:rPr>
+                <w:rFonts w:ascii="Calibri" w:hAnsi="Calibri" w:cs="Calibri"/>
+              </w:rPr>
+              <w:t>Propriete → Propriete</w:t>
+            </w:r>
           </w:p>
         </w:tc>
         <w:tc>
@@ -3831,22 +3130,12 @@
                 <w:rFonts w:ascii="Calibri" w:hAnsi="Calibri" w:cs="Calibri"/>
               </w:rPr>
             </w:pPr>
-            <w:proofErr w:type="spellStart"/>
-            <w:proofErr w:type="gramStart"/>
-            <w:r>
-              <w:rPr>
-                <w:rFonts w:ascii="Calibri" w:hAnsi="Calibri" w:cs="Calibri"/>
-              </w:rPr>
-              <w:t>score</w:t>
-            </w:r>
-            <w:proofErr w:type="gramEnd"/>
-            <w:r>
-              <w:rPr>
-                <w:rFonts w:ascii="Calibri" w:hAnsi="Calibri" w:cs="Calibri"/>
-              </w:rPr>
-              <w:t>_amenagement</w:t>
-            </w:r>
-            <w:proofErr w:type="spellEnd"/>
+            <w:r>
+              <w:rPr>
+                <w:rFonts w:ascii="Calibri" w:hAnsi="Calibri" w:cs="Calibri"/>
+              </w:rPr>
+              <w:t>score_amenagement</w:t>
+            </w:r>
           </w:p>
         </w:tc>
         <w:tc>
@@ -3933,23 +3222,7 @@
         <w:t xml:space="preserve"> </w:t>
       </w:r>
       <w:r>
-        <w:t xml:space="preserve">: JWT </w:t>
-      </w:r>
-      <w:proofErr w:type="spellStart"/>
-      <w:r>
-        <w:t>tokens</w:t>
-      </w:r>
-      <w:proofErr w:type="spellEnd"/>
-      <w:r>
-        <w:t xml:space="preserve">, CORS configuré, validation </w:t>
-      </w:r>
-      <w:proofErr w:type="spellStart"/>
-      <w:r>
-        <w:t>Pydantic</w:t>
-      </w:r>
-      <w:proofErr w:type="spellEnd"/>
-      <w:r>
-        <w:t>, protection données RGPD</w:t>
+        <w:t>: JWT tokens, CORS configuré, validation Pydantic, protection données RGPD</w:t>
       </w:r>
     </w:p>
     <w:p>
@@ -4000,14 +3273,7 @@
         <w:rPr>
           <w:lang w:val="en-US"/>
         </w:rPr>
-        <w:t>Type-</w:t>
-      </w:r>
-      <w:proofErr w:type="gramStart"/>
-      <w:r>
-        <w:rPr>
-          <w:lang w:val="en-US"/>
-        </w:rPr>
-        <w:t>safety</w:t>
+        <w:t>Type-safety</w:t>
       </w:r>
       <w:r>
         <w:rPr>
@@ -4019,28 +3285,7 @@
         <w:rPr>
           <w:lang w:val="en-US"/>
         </w:rPr>
-        <w:t>:</w:t>
-      </w:r>
-      <w:proofErr w:type="gramEnd"/>
-      <w:r>
-        <w:rPr>
-          <w:lang w:val="en-US"/>
-        </w:rPr>
-        <w:t xml:space="preserve"> Types </w:t>
-      </w:r>
-      <w:proofErr w:type="spellStart"/>
-      <w:r>
-        <w:rPr>
-          <w:lang w:val="en-US"/>
-        </w:rPr>
-        <w:t>propagés</w:t>
-      </w:r>
-      <w:proofErr w:type="spellEnd"/>
-      <w:r>
-        <w:rPr>
-          <w:lang w:val="en-US"/>
-        </w:rPr>
-        <w:t xml:space="preserve"> end-to-end (Neo4j → FastAPI → GraphQL → React TypeScript)</w:t>
+        <w:t>: Types propagés end-to-end (Neo4j → FastAPI → GraphQL → React TypeScript)</w:t>
       </w:r>
     </w:p>
     <w:p>
@@ -4057,15 +3302,7 @@
         <w:t xml:space="preserve"> </w:t>
       </w:r>
       <w:r>
-        <w:t xml:space="preserve">: Gestion erreurs robuste, cache Apollo Client, </w:t>
-      </w:r>
-      <w:proofErr w:type="spellStart"/>
-      <w:r>
-        <w:t>retry</w:t>
-      </w:r>
-      <w:proofErr w:type="spellEnd"/>
-      <w:r>
-        <w:t xml:space="preserve"> automatique</w:t>
+        <w:t>: Gestion erreurs robuste, cache Apollo Client, retry automatique</w:t>
       </w:r>
     </w:p>
     <w:p>
@@ -4077,7 +3314,6 @@
         </w:rPr>
       </w:pPr>
       <w:r>
-        <w:lastRenderedPageBreak/>
         <w:t>7. Déploiement et maintenance</w:t>
       </w:r>
     </w:p>
@@ -4101,15 +3337,7 @@
         </w:numPr>
       </w:pPr>
       <w:r>
-        <w:t xml:space="preserve">Backend FastAPI : </w:t>
-      </w:r>
-      <w:proofErr w:type="gramStart"/>
-      <w:r>
-        <w:t>localhost:</w:t>
-      </w:r>
-      <w:proofErr w:type="gramEnd"/>
-      <w:r>
-        <w:t>8000</w:t>
+        <w:t>Backend FastAPI : localhost:8000</w:t>
       </w:r>
     </w:p>
     <w:p>
@@ -4120,23 +3348,7 @@
         </w:numPr>
       </w:pPr>
       <w:r>
-        <w:t xml:space="preserve">Frontend </w:t>
-      </w:r>
-      <w:proofErr w:type="spellStart"/>
-      <w:r>
-        <w:t>React</w:t>
-      </w:r>
-      <w:proofErr w:type="spellEnd"/>
-      <w:r>
-        <w:t xml:space="preserve"> : </w:t>
-      </w:r>
-      <w:proofErr w:type="gramStart"/>
-      <w:r>
-        <w:t>localhost:</w:t>
-      </w:r>
-      <w:proofErr w:type="gramEnd"/>
-      <w:r>
-        <w:t>3000 (Vite dev server)</w:t>
+        <w:t>Frontend React : localhost:3000 (Vite dev server)</w:t>
       </w:r>
     </w:p>
     <w:p>
@@ -4158,6 +3370,7 @@
         </w:numPr>
       </w:pPr>
       <w:r>
+        <w:lastRenderedPageBreak/>
         <w:t>Git/GitHub : Version control + collaboration</w:t>
       </w:r>
     </w:p>
@@ -4193,21 +3406,7 @@
         <w:rPr>
           <w:lang w:val="en-US"/>
         </w:rPr>
-        <w:t xml:space="preserve"> </w:t>
-      </w:r>
-      <w:proofErr w:type="spellStart"/>
-      <w:r>
-        <w:rPr>
-          <w:lang w:val="en-US"/>
-        </w:rPr>
-        <w:t>Déploiement</w:t>
-      </w:r>
-      <w:proofErr w:type="spellEnd"/>
-      <w:r>
-        <w:rPr>
-          <w:lang w:val="en-US"/>
-        </w:rPr>
-        <w:t xml:space="preserve"> cloud (Heroku, Railway, AWS)</w:t>
+        <w:t xml:space="preserve"> Déploiement cloud (Heroku, Railway, AWS)</w:t>
       </w:r>
     </w:p>
     <w:p>
@@ -4218,21 +3417,8 @@
         </w:numPr>
       </w:pPr>
       <w:r>
-        <w:t xml:space="preserve">Frontend : </w:t>
-      </w:r>
-      <w:proofErr w:type="spellStart"/>
-      <w:r>
-        <w:t>Vercel</w:t>
-      </w:r>
-      <w:proofErr w:type="spellEnd"/>
-      <w:r>
-        <w:t xml:space="preserve"> ou </w:t>
-      </w:r>
-      <w:proofErr w:type="spellStart"/>
-      <w:r>
-        <w:t>Netlify</w:t>
-      </w:r>
-      <w:proofErr w:type="spellEnd"/>
+        <w:t>Frontend : Vercel ou Netlify</w:t>
+      </w:r>
     </w:p>
     <w:p>
       <w:pPr>
@@ -4387,13 +3573,8 @@
               <w:cnfStyle w:val="000000100000" w:firstRow="0" w:lastRow="0" w:firstColumn="0" w:lastColumn="0" w:oddVBand="0" w:evenVBand="0" w:oddHBand="1" w:evenHBand="0" w:firstRowFirstColumn="0" w:firstRowLastColumn="0" w:lastRowFirstColumn="0" w:lastRowLastColumn="0"/>
             </w:pPr>
             <w:r>
-              <w:t>Modèle Neo4j finalisé, diagrammes UML/</w:t>
-            </w:r>
-            <w:proofErr w:type="spellStart"/>
-            <w:r>
-              <w:t>Arrows</w:t>
-            </w:r>
-            <w:proofErr w:type="spellEnd"/>
+              <w:t>Modèle Neo4j finalisé, diagrammes UML/Arrows</w:t>
+            </w:r>
           </w:p>
         </w:tc>
       </w:tr>
@@ -4442,23 +3623,7 @@
               <w:cnfStyle w:val="000000000000" w:firstRow="0" w:lastRow="0" w:firstColumn="0" w:lastColumn="0" w:oddVBand="0" w:evenVBand="0" w:oddHBand="0" w:evenHBand="0" w:firstRowFirstColumn="0" w:firstRowLastColumn="0" w:lastRowFirstColumn="0" w:lastRowLastColumn="0"/>
             </w:pPr>
             <w:r>
-              <w:t xml:space="preserve">FastAPI </w:t>
-            </w:r>
-            <w:proofErr w:type="spellStart"/>
-            <w:r>
-              <w:t>endpoints</w:t>
-            </w:r>
-            <w:proofErr w:type="spellEnd"/>
-            <w:r>
-              <w:t xml:space="preserve">, GraphQL </w:t>
-            </w:r>
-            <w:proofErr w:type="spellStart"/>
-            <w:r>
-              <w:t>schema</w:t>
-            </w:r>
-            <w:proofErr w:type="spellEnd"/>
-            <w:r>
-              <w:t>, connexion Neo4j</w:t>
+              <w:t>FastAPI endpoints, GraphQL schema, connexion Neo4j</w:t>
             </w:r>
           </w:p>
         </w:tc>
@@ -4571,16 +3736,8 @@
               <w:rPr>
                 <w:lang w:val="en-US"/>
               </w:rPr>
-              <w:t xml:space="preserve">Tests end-to-end, correction bugs, </w:t>
-            </w:r>
-            <w:proofErr w:type="spellStart"/>
-            <w:r>
-              <w:rPr>
-                <w:lang w:val="en-US"/>
-              </w:rPr>
-              <w:t>optimisation</w:t>
-            </w:r>
-            <w:proofErr w:type="spellEnd"/>
+              <w:t>Tests end-to-end, correction bugs, optimisation</w:t>
+            </w:r>
           </w:p>
         </w:tc>
       </w:tr>
@@ -4617,11 +3774,9 @@
       <w:r>
         <w:t xml:space="preserve"> </w:t>
       </w:r>
-      <w:proofErr w:type="spellStart"/>
       <w:r>
         <w:t>GraphImmo</w:t>
       </w:r>
-      <w:proofErr w:type="spellEnd"/>
       <w:r>
         <w:t xml:space="preserve"> </w:t>
       </w:r>

</xml_diff>

<commit_message>
UML Architecture & Mermaids
</commit_message>
<xml_diff>
--- a/Documentation/CAHIER DES CHARGES - GRAPHIMMO.docx
+++ b/Documentation/CAHIER DES CHARGES - GRAPHIMMO.docx
@@ -56,7 +56,15 @@
     </w:p>
     <w:p>
       <w:r>
-        <w:t>Le projet GraphImmo vise à développer</w:t>
+        <w:t xml:space="preserve">Le projet </w:t>
+      </w:r>
+      <w:proofErr w:type="spellStart"/>
+      <w:r>
+        <w:t>GraphImmo</w:t>
+      </w:r>
+      <w:proofErr w:type="spellEnd"/>
+      <w:r>
+        <w:t xml:space="preserve"> vise à développer</w:t>
       </w:r>
       <w:r>
         <w:t xml:space="preserve"> </w:t>
@@ -221,7 +229,15 @@
         <w:t xml:space="preserve"> </w:t>
       </w:r>
       <w:r>
-        <w:t>des statistiques et analytics avancés.</w:t>
+        <w:t xml:space="preserve">des statistiques et </w:t>
+      </w:r>
+      <w:proofErr w:type="spellStart"/>
+      <w:r>
+        <w:t>analytics</w:t>
+      </w:r>
+      <w:proofErr w:type="spellEnd"/>
+      <w:r>
+        <w:t xml:space="preserve"> avancés.</w:t>
       </w:r>
     </w:p>
     <w:p>
@@ -449,8 +465,13 @@
           <w:numId w:val="5"/>
         </w:numPr>
       </w:pPr>
-      <w:r>
-        <w:t>Ranking Neo4j GDS (PageRank, détection communautés)</w:t>
+      <w:proofErr w:type="spellStart"/>
+      <w:r>
+        <w:t>Ranking</w:t>
+      </w:r>
+      <w:proofErr w:type="spellEnd"/>
+      <w:r>
+        <w:t xml:space="preserve"> Neo4j GDS (PageRank, détection communautés)</w:t>
       </w:r>
     </w:p>
     <w:p>
@@ -552,7 +573,15 @@
         </w:numPr>
       </w:pPr>
       <w:r>
-        <w:t>Suivi statut (en_attente, acceptée, refusée)</w:t>
+        <w:t>Suivi statut (</w:t>
+      </w:r>
+      <w:proofErr w:type="spellStart"/>
+      <w:r>
+        <w:t>en_attente</w:t>
+      </w:r>
+      <w:proofErr w:type="spellEnd"/>
+      <w:r>
+        <w:t>, acceptée, refusée)</w:t>
       </w:r>
     </w:p>
     <w:p>
@@ -758,7 +787,15 @@
         <w:t xml:space="preserve"> </w:t>
       </w:r>
       <w:r>
-        <w:t>: Python FastAPI (async, haute performance)</w:t>
+        <w:t>: Python FastAPI (</w:t>
+      </w:r>
+      <w:proofErr w:type="spellStart"/>
+      <w:r>
+        <w:t>async</w:t>
+      </w:r>
+      <w:proofErr w:type="spellEnd"/>
+      <w:r>
+        <w:t>, haute performance)</w:t>
       </w:r>
     </w:p>
     <w:p>
@@ -843,8 +880,21 @@
         <w:t xml:space="preserve"> </w:t>
       </w:r>
       <w:r>
-        <w:t>: Pydantic pour type-safe</w:t>
-      </w:r>
+        <w:t xml:space="preserve">: </w:t>
+      </w:r>
+      <w:proofErr w:type="spellStart"/>
+      <w:r>
+        <w:t>Pydantic</w:t>
+      </w:r>
+      <w:proofErr w:type="spellEnd"/>
+      <w:r>
+        <w:t xml:space="preserve"> pour type-</w:t>
+      </w:r>
+      <w:proofErr w:type="spellStart"/>
+      <w:r>
+        <w:t>safe</w:t>
+      </w:r>
+      <w:proofErr w:type="spellEnd"/>
     </w:p>
     <w:p>
       <w:pPr>
@@ -872,8 +922,21 @@
         <w:t xml:space="preserve"> </w:t>
       </w:r>
       <w:r>
-        <w:t>: React 18+ avec TypeScript</w:t>
-      </w:r>
+        <w:t xml:space="preserve">: </w:t>
+      </w:r>
+      <w:proofErr w:type="spellStart"/>
+      <w:r>
+        <w:t>React</w:t>
+      </w:r>
+      <w:proofErr w:type="spellEnd"/>
+      <w:r>
+        <w:t xml:space="preserve"> 18+ avec </w:t>
+      </w:r>
+      <w:proofErr w:type="spellStart"/>
+      <w:r>
+        <w:t>TypeScript</w:t>
+      </w:r>
+      <w:proofErr w:type="spellEnd"/>
     </w:p>
     <w:p>
       <w:pPr>
@@ -923,8 +986,21 @@
         <w:t xml:space="preserve"> </w:t>
       </w:r>
       <w:r>
-        <w:t>: Material-UI ou TailwindCSS</w:t>
-      </w:r>
+        <w:t xml:space="preserve">: </w:t>
+      </w:r>
+      <w:proofErr w:type="spellStart"/>
+      <w:r>
+        <w:t>Material</w:t>
+      </w:r>
+      <w:proofErr w:type="spellEnd"/>
+      <w:r>
+        <w:t xml:space="preserve">-UI ou </w:t>
+      </w:r>
+      <w:proofErr w:type="spellStart"/>
+      <w:r>
+        <w:t>TailwindCSS</w:t>
+      </w:r>
+      <w:proofErr w:type="spellEnd"/>
     </w:p>
     <w:p>
       <w:pPr>
@@ -933,9 +1009,19 @@
           <w:numId w:val="13"/>
         </w:numPr>
       </w:pPr>
-      <w:r>
-        <w:t>Build tool</w:t>
-      </w:r>
+      <w:proofErr w:type="spellStart"/>
+      <w:r>
+        <w:t>Build</w:t>
+      </w:r>
+      <w:proofErr w:type="spellEnd"/>
+      <w:r>
+        <w:t xml:space="preserve"> </w:t>
+      </w:r>
+      <w:proofErr w:type="spellStart"/>
+      <w:r>
+        <w:t>tool</w:t>
+      </w:r>
+      <w:proofErr w:type="spellEnd"/>
       <w:r>
         <w:t xml:space="preserve"> </w:t>
       </w:r>
@@ -957,7 +1043,15 @@
         <w:t xml:space="preserve"> </w:t>
       </w:r>
       <w:r>
-        <w:t>: Apollo Cache + Context AP</w:t>
+        <w:t xml:space="preserve">: Apollo Cache + </w:t>
+      </w:r>
+      <w:proofErr w:type="spellStart"/>
+      <w:r>
+        <w:t>Context</w:t>
+      </w:r>
+      <w:proofErr w:type="spellEnd"/>
+      <w:r>
+        <w:t xml:space="preserve"> AP</w:t>
       </w:r>
       <w:r>
         <w:t>I</w:t>
@@ -1106,7 +1200,13 @@
         <w:pStyle w:val="Titre2"/>
       </w:pPr>
       <w:r>
-        <w:t>5.1. Nœuds principaux (8 nœuds)</w:t>
+        <w:t>5.1. Nœuds principaux (</w:t>
+      </w:r>
+      <w:r>
+        <w:t>9</w:t>
+      </w:r>
+      <w:r>
+        <w:t xml:space="preserve"> nœuds)</w:t>
       </w:r>
     </w:p>
     <w:tbl>
@@ -1233,15 +1333,88 @@
                 <w:rFonts w:ascii="Calibri" w:hAnsi="Calibri" w:cs="Calibri"/>
                 <w:lang w:val="en-US"/>
               </w:rPr>
-              <w:t>id, nom, prenom, email, budget, preferences_location, surface_min, ville_prefs[]</w:t>
-            </w:r>
+              <w:t xml:space="preserve">id, nom, </w:t>
+            </w:r>
+            <w:proofErr w:type="spellStart"/>
             <w:r>
               <w:rPr>
                 <w:rFonts w:ascii="Calibri" w:hAnsi="Calibri" w:cs="Calibri"/>
                 <w:lang w:val="en-US"/>
               </w:rPr>
-              <w:t>, created_at</w:t>
-            </w:r>
+              <w:t>prenom</w:t>
+            </w:r>
+            <w:proofErr w:type="spellEnd"/>
+            <w:r>
+              <w:rPr>
+                <w:rFonts w:ascii="Calibri" w:hAnsi="Calibri" w:cs="Calibri"/>
+                <w:lang w:val="en-US"/>
+              </w:rPr>
+              <w:t xml:space="preserve">, email, budget, </w:t>
+            </w:r>
+            <w:proofErr w:type="spellStart"/>
+            <w:r>
+              <w:rPr>
+                <w:rFonts w:ascii="Calibri" w:hAnsi="Calibri" w:cs="Calibri"/>
+                <w:lang w:val="en-US"/>
+              </w:rPr>
+              <w:t>preferences_location</w:t>
+            </w:r>
+            <w:proofErr w:type="spellEnd"/>
+            <w:r>
+              <w:rPr>
+                <w:rFonts w:ascii="Calibri" w:hAnsi="Calibri" w:cs="Calibri"/>
+                <w:lang w:val="en-US"/>
+              </w:rPr>
+              <w:t xml:space="preserve">, </w:t>
+            </w:r>
+            <w:proofErr w:type="spellStart"/>
+            <w:r>
+              <w:rPr>
+                <w:rFonts w:ascii="Calibri" w:hAnsi="Calibri" w:cs="Calibri"/>
+                <w:lang w:val="en-US"/>
+              </w:rPr>
+              <w:t>surface_min</w:t>
+            </w:r>
+            <w:proofErr w:type="spellEnd"/>
+            <w:r>
+              <w:rPr>
+                <w:rFonts w:ascii="Calibri" w:hAnsi="Calibri" w:cs="Calibri"/>
+                <w:lang w:val="en-US"/>
+              </w:rPr>
+              <w:t xml:space="preserve">, </w:t>
+            </w:r>
+            <w:proofErr w:type="spellStart"/>
+            <w:r>
+              <w:rPr>
+                <w:rFonts w:ascii="Calibri" w:hAnsi="Calibri" w:cs="Calibri"/>
+                <w:lang w:val="en-US"/>
+              </w:rPr>
+              <w:t>ville_prefs</w:t>
+            </w:r>
+            <w:proofErr w:type="spellEnd"/>
+            <w:r>
+              <w:rPr>
+                <w:rFonts w:ascii="Calibri" w:hAnsi="Calibri" w:cs="Calibri"/>
+                <w:lang w:val="en-US"/>
+              </w:rPr>
+              <w:t>[]</w:t>
+            </w:r>
+            <w:r>
+              <w:rPr>
+                <w:rFonts w:ascii="Calibri" w:hAnsi="Calibri" w:cs="Calibri"/>
+                <w:lang w:val="en-US"/>
+              </w:rPr>
+              <w:t xml:space="preserve">, </w:t>
+            </w:r>
+            <w:proofErr w:type="spellStart"/>
+            <w:r>
+              <w:rPr>
+                <w:rFonts w:ascii="Calibri" w:hAnsi="Calibri" w:cs="Calibri"/>
+                <w:lang w:val="en-US"/>
+              </w:rPr>
+              <w:t>created_at</w:t>
+            </w:r>
+            <w:proofErr w:type="spellEnd"/>
             <w:r>
               <w:rPr>
                 <w:rFonts w:ascii="Calibri" w:hAnsi="Calibri" w:cs="Calibri"/>
@@ -1287,12 +1460,14 @@
                 <w:rFonts w:ascii="Calibri" w:hAnsi="Calibri" w:cs="Calibri"/>
               </w:rPr>
             </w:pPr>
+            <w:proofErr w:type="spellStart"/>
             <w:r>
               <w:rPr>
                 <w:rFonts w:ascii="Calibri" w:hAnsi="Calibri" w:cs="Calibri"/>
               </w:rPr>
               <w:t>Propriete</w:t>
             </w:r>
+            <w:proofErr w:type="spellEnd"/>
           </w:p>
         </w:tc>
         <w:tc>
@@ -1312,14 +1487,50 @@
               <w:rPr>
                 <w:rFonts w:ascii="Calibri" w:hAnsi="Calibri" w:cs="Calibri"/>
               </w:rPr>
-              <w:t>id, titre, description, prix, surface, chambres, adresse, geo[lat,lon]</w:t>
-            </w:r>
-            <w:r>
-              <w:rPr>
-                <w:rFonts w:ascii="Calibri" w:hAnsi="Calibri" w:cs="Calibri"/>
-              </w:rPr>
-              <w:t>, pageRank</w:t>
-            </w:r>
+              <w:t xml:space="preserve">id, titre, description, prix, surface, chambres, adresse, </w:t>
+            </w:r>
+            <w:proofErr w:type="spellStart"/>
+            <w:r>
+              <w:rPr>
+                <w:rFonts w:ascii="Calibri" w:hAnsi="Calibri" w:cs="Calibri"/>
+              </w:rPr>
+              <w:t>geo</w:t>
+            </w:r>
+            <w:proofErr w:type="spellEnd"/>
+            <w:r>
+              <w:rPr>
+                <w:rFonts w:ascii="Calibri" w:hAnsi="Calibri" w:cs="Calibri"/>
+              </w:rPr>
+              <w:t>[</w:t>
+            </w:r>
+            <w:proofErr w:type="spellStart"/>
+            <w:r>
+              <w:rPr>
+                <w:rFonts w:ascii="Calibri" w:hAnsi="Calibri" w:cs="Calibri"/>
+              </w:rPr>
+              <w:t>lat,lon</w:t>
+            </w:r>
+            <w:proofErr w:type="spellEnd"/>
+            <w:r>
+              <w:rPr>
+                <w:rFonts w:ascii="Calibri" w:hAnsi="Calibri" w:cs="Calibri"/>
+              </w:rPr>
+              <w:t>]</w:t>
+            </w:r>
+            <w:r>
+              <w:rPr>
+                <w:rFonts w:ascii="Calibri" w:hAnsi="Calibri" w:cs="Calibri"/>
+              </w:rPr>
+              <w:t xml:space="preserve">, </w:t>
+            </w:r>
+            <w:proofErr w:type="spellStart"/>
+            <w:r>
+              <w:rPr>
+                <w:rFonts w:ascii="Calibri" w:hAnsi="Calibri" w:cs="Calibri"/>
+              </w:rPr>
+              <w:t>pageRank</w:t>
+            </w:r>
+            <w:proofErr w:type="spellEnd"/>
           </w:p>
         </w:tc>
         <w:tc>
@@ -1386,7 +1597,21 @@
               <w:rPr>
                 <w:rFonts w:ascii="Calibri" w:hAnsi="Calibri" w:cs="Calibri"/>
               </w:rPr>
-              <w:t>id, nom, telephone, email, adresse</w:t>
+              <w:t xml:space="preserve">id, nom, </w:t>
+            </w:r>
+            <w:proofErr w:type="spellStart"/>
+            <w:r>
+              <w:rPr>
+                <w:rFonts w:ascii="Calibri" w:hAnsi="Calibri" w:cs="Calibri"/>
+              </w:rPr>
+              <w:t>telephone</w:t>
+            </w:r>
+            <w:proofErr w:type="spellEnd"/>
+            <w:r>
+              <w:rPr>
+                <w:rFonts w:ascii="Calibri" w:hAnsi="Calibri" w:cs="Calibri"/>
+              </w:rPr>
+              <w:t>, email, adresse</w:t>
             </w:r>
           </w:p>
         </w:tc>
@@ -1451,13 +1676,35 @@
               <w:rPr>
                 <w:rFonts w:ascii="Calibri" w:hAnsi="Calibri" w:cs="Calibri"/>
               </w:rPr>
-              <w:t xml:space="preserve">latitude, longitude, commune, region, prix_m2, </w:t>
-            </w:r>
-            <w:r>
-              <w:rPr>
-                <w:rFonts w:ascii="Calibri" w:hAnsi="Calibri" w:cs="Calibri"/>
-              </w:rPr>
-              <w:t>securite, id</w:t>
+              <w:t xml:space="preserve">latitude, longitude, commune, </w:t>
+            </w:r>
+            <w:proofErr w:type="spellStart"/>
+            <w:r>
+              <w:rPr>
+                <w:rFonts w:ascii="Calibri" w:hAnsi="Calibri" w:cs="Calibri"/>
+              </w:rPr>
+              <w:t>region</w:t>
+            </w:r>
+            <w:proofErr w:type="spellEnd"/>
+            <w:r>
+              <w:rPr>
+                <w:rFonts w:ascii="Calibri" w:hAnsi="Calibri" w:cs="Calibri"/>
+              </w:rPr>
+              <w:t xml:space="preserve">, prix_m2, </w:t>
+            </w:r>
+            <w:proofErr w:type="spellStart"/>
+            <w:r>
+              <w:rPr>
+                <w:rFonts w:ascii="Calibri" w:hAnsi="Calibri" w:cs="Calibri"/>
+              </w:rPr>
+              <w:t>securite</w:t>
+            </w:r>
+            <w:proofErr w:type="spellEnd"/>
+            <w:r>
+              <w:rPr>
+                <w:rFonts w:ascii="Calibri" w:hAnsi="Calibri" w:cs="Calibri"/>
+              </w:rPr>
+              <w:t>, id</w:t>
             </w:r>
           </w:p>
         </w:tc>
@@ -1521,11 +1768,19 @@
                 <w:rFonts w:ascii="Calibri" w:hAnsi="Calibri" w:cs="Calibri"/>
               </w:rPr>
             </w:pPr>
-            <w:r>
-              <w:rPr>
-                <w:rFonts w:ascii="Calibri" w:hAnsi="Calibri" w:cs="Calibri"/>
-              </w:rPr>
-              <w:t xml:space="preserve">date_visite, </w:t>
+            <w:proofErr w:type="spellStart"/>
+            <w:r>
+              <w:rPr>
+                <w:rFonts w:ascii="Calibri" w:hAnsi="Calibri" w:cs="Calibri"/>
+              </w:rPr>
+              <w:t>date_visite</w:t>
+            </w:r>
+            <w:proofErr w:type="spellEnd"/>
+            <w:r>
+              <w:rPr>
+                <w:rFonts w:ascii="Calibri" w:hAnsi="Calibri" w:cs="Calibri"/>
+              </w:rPr>
+              <w:t xml:space="preserve">, </w:t>
             </w:r>
             <w:r>
               <w:rPr>
@@ -1596,8 +1851,86 @@
               <w:rPr>
                 <w:rFonts w:ascii="Calibri" w:hAnsi="Calibri" w:cs="Calibri"/>
               </w:rPr>
-              <w:t>id, date, date_souhaitee, demandeid, heure, lu, message, propriete_id, proriete_titre, type, user_nom, user_id</w:t>
-            </w:r>
+              <w:t xml:space="preserve">id, date, </w:t>
+            </w:r>
+            <w:proofErr w:type="spellStart"/>
+            <w:r>
+              <w:rPr>
+                <w:rFonts w:ascii="Calibri" w:hAnsi="Calibri" w:cs="Calibri"/>
+              </w:rPr>
+              <w:t>date_souhaitee</w:t>
+            </w:r>
+            <w:proofErr w:type="spellEnd"/>
+            <w:r>
+              <w:rPr>
+                <w:rFonts w:ascii="Calibri" w:hAnsi="Calibri" w:cs="Calibri"/>
+              </w:rPr>
+              <w:t xml:space="preserve">, </w:t>
+            </w:r>
+            <w:proofErr w:type="spellStart"/>
+            <w:r>
+              <w:rPr>
+                <w:rFonts w:ascii="Calibri" w:hAnsi="Calibri" w:cs="Calibri"/>
+              </w:rPr>
+              <w:t>demandeid</w:t>
+            </w:r>
+            <w:proofErr w:type="spellEnd"/>
+            <w:r>
+              <w:rPr>
+                <w:rFonts w:ascii="Calibri" w:hAnsi="Calibri" w:cs="Calibri"/>
+              </w:rPr>
+              <w:t xml:space="preserve">, heure, lu, message, </w:t>
+            </w:r>
+            <w:proofErr w:type="spellStart"/>
+            <w:r>
+              <w:rPr>
+                <w:rFonts w:ascii="Calibri" w:hAnsi="Calibri" w:cs="Calibri"/>
+              </w:rPr>
+              <w:t>propriete_id</w:t>
+            </w:r>
+            <w:proofErr w:type="spellEnd"/>
+            <w:r>
+              <w:rPr>
+                <w:rFonts w:ascii="Calibri" w:hAnsi="Calibri" w:cs="Calibri"/>
+              </w:rPr>
+              <w:t xml:space="preserve">, </w:t>
+            </w:r>
+            <w:proofErr w:type="spellStart"/>
+            <w:r>
+              <w:rPr>
+                <w:rFonts w:ascii="Calibri" w:hAnsi="Calibri" w:cs="Calibri"/>
+              </w:rPr>
+              <w:t>proriete_titre</w:t>
+            </w:r>
+            <w:proofErr w:type="spellEnd"/>
+            <w:r>
+              <w:rPr>
+                <w:rFonts w:ascii="Calibri" w:hAnsi="Calibri" w:cs="Calibri"/>
+              </w:rPr>
+              <w:t xml:space="preserve">, type, </w:t>
+            </w:r>
+            <w:proofErr w:type="spellStart"/>
+            <w:r>
+              <w:rPr>
+                <w:rFonts w:ascii="Calibri" w:hAnsi="Calibri" w:cs="Calibri"/>
+              </w:rPr>
+              <w:t>user_nom</w:t>
+            </w:r>
+            <w:proofErr w:type="spellEnd"/>
+            <w:r>
+              <w:rPr>
+                <w:rFonts w:ascii="Calibri" w:hAnsi="Calibri" w:cs="Calibri"/>
+              </w:rPr>
+              <w:t xml:space="preserve">, </w:t>
+            </w:r>
+            <w:proofErr w:type="spellStart"/>
+            <w:r>
+              <w:rPr>
+                <w:rFonts w:ascii="Calibri" w:hAnsi="Calibri" w:cs="Calibri"/>
+              </w:rPr>
+              <w:t>user_id</w:t>
+            </w:r>
+            <w:proofErr w:type="spellEnd"/>
           </w:p>
         </w:tc>
         <w:tc>
@@ -1658,11 +1991,75 @@
                 <w:rFonts w:ascii="Calibri" w:hAnsi="Calibri" w:cs="Calibri"/>
               </w:rPr>
             </w:pPr>
-            <w:r>
-              <w:rPr>
-                <w:rFonts w:ascii="Calibri" w:hAnsi="Calibri" w:cs="Calibri"/>
-              </w:rPr>
-              <w:t>agent_nom, date, demandeid, lu, message, nouveau_statut, type, propriete_id, propriete_titre,</w:t>
+            <w:proofErr w:type="spellStart"/>
+            <w:r>
+              <w:rPr>
+                <w:rFonts w:ascii="Calibri" w:hAnsi="Calibri" w:cs="Calibri"/>
+              </w:rPr>
+              <w:t>agent_nom</w:t>
+            </w:r>
+            <w:proofErr w:type="spellEnd"/>
+            <w:r>
+              <w:rPr>
+                <w:rFonts w:ascii="Calibri" w:hAnsi="Calibri" w:cs="Calibri"/>
+              </w:rPr>
+              <w:t xml:space="preserve">, date, </w:t>
+            </w:r>
+            <w:proofErr w:type="spellStart"/>
+            <w:r>
+              <w:rPr>
+                <w:rFonts w:ascii="Calibri" w:hAnsi="Calibri" w:cs="Calibri"/>
+              </w:rPr>
+              <w:t>demandeid</w:t>
+            </w:r>
+            <w:proofErr w:type="spellEnd"/>
+            <w:r>
+              <w:rPr>
+                <w:rFonts w:ascii="Calibri" w:hAnsi="Calibri" w:cs="Calibri"/>
+              </w:rPr>
+              <w:t xml:space="preserve">, lu, message, </w:t>
+            </w:r>
+            <w:proofErr w:type="spellStart"/>
+            <w:r>
+              <w:rPr>
+                <w:rFonts w:ascii="Calibri" w:hAnsi="Calibri" w:cs="Calibri"/>
+              </w:rPr>
+              <w:t>nouveau_statut</w:t>
+            </w:r>
+            <w:proofErr w:type="spellEnd"/>
+            <w:r>
+              <w:rPr>
+                <w:rFonts w:ascii="Calibri" w:hAnsi="Calibri" w:cs="Calibri"/>
+              </w:rPr>
+              <w:t xml:space="preserve">, type, </w:t>
+            </w:r>
+            <w:proofErr w:type="spellStart"/>
+            <w:r>
+              <w:rPr>
+                <w:rFonts w:ascii="Calibri" w:hAnsi="Calibri" w:cs="Calibri"/>
+              </w:rPr>
+              <w:t>propriete_id</w:t>
+            </w:r>
+            <w:proofErr w:type="spellEnd"/>
+            <w:r>
+              <w:rPr>
+                <w:rFonts w:ascii="Calibri" w:hAnsi="Calibri" w:cs="Calibri"/>
+              </w:rPr>
+              <w:t xml:space="preserve">, </w:t>
+            </w:r>
+            <w:proofErr w:type="spellStart"/>
+            <w:r>
+              <w:rPr>
+                <w:rFonts w:ascii="Calibri" w:hAnsi="Calibri" w:cs="Calibri"/>
+              </w:rPr>
+              <w:t>propriete_titre</w:t>
+            </w:r>
+            <w:proofErr w:type="spellEnd"/>
+            <w:r>
+              <w:rPr>
+                <w:rFonts w:ascii="Calibri" w:hAnsi="Calibri" w:cs="Calibri"/>
+              </w:rPr>
+              <w:t>,</w:t>
             </w:r>
             <w:r>
               <w:rPr>
@@ -1694,13 +2091,7 @@
               <w:rPr>
                 <w:rFonts w:ascii="Calibri" w:hAnsi="Calibri" w:cs="Calibri"/>
               </w:rPr>
-              <w:t xml:space="preserve">Notification pour </w:t>
-            </w:r>
-            <w:r>
-              <w:rPr>
-                <w:rFonts w:ascii="Calibri" w:hAnsi="Calibri" w:cs="Calibri"/>
-              </w:rPr>
-              <w:t>user</w:t>
+              <w:t>Notification pour user</w:t>
             </w:r>
           </w:p>
         </w:tc>
@@ -1719,12 +2110,14 @@
                 <w:rFonts w:ascii="Calibri" w:hAnsi="Calibri" w:cs="Calibri"/>
               </w:rPr>
             </w:pPr>
+            <w:proofErr w:type="spellStart"/>
             <w:r>
               <w:rPr>
                 <w:rFonts w:ascii="Calibri" w:hAnsi="Calibri" w:cs="Calibri"/>
               </w:rPr>
               <w:t>Amenagement</w:t>
             </w:r>
+            <w:proofErr w:type="spellEnd"/>
           </w:p>
         </w:tc>
         <w:tc>
@@ -1744,8 +2137,30 @@
               <w:rPr>
                 <w:rFonts w:ascii="Calibri" w:hAnsi="Calibri" w:cs="Calibri"/>
               </w:rPr>
-              <w:t>type(piscine|garage), qualite</w:t>
-            </w:r>
+              <w:t>type(</w:t>
+            </w:r>
+            <w:proofErr w:type="spellStart"/>
+            <w:r>
+              <w:rPr>
+                <w:rFonts w:ascii="Calibri" w:hAnsi="Calibri" w:cs="Calibri"/>
+              </w:rPr>
+              <w:t>piscine|garage</w:t>
+            </w:r>
+            <w:proofErr w:type="spellEnd"/>
+            <w:r>
+              <w:rPr>
+                <w:rFonts w:ascii="Calibri" w:hAnsi="Calibri" w:cs="Calibri"/>
+              </w:rPr>
+              <w:t xml:space="preserve">), </w:t>
+            </w:r>
+            <w:proofErr w:type="spellStart"/>
+            <w:r>
+              <w:rPr>
+                <w:rFonts w:ascii="Calibri" w:hAnsi="Calibri" w:cs="Calibri"/>
+              </w:rPr>
+              <w:t>qualite</w:t>
+            </w:r>
+            <w:proofErr w:type="spellEnd"/>
             <w:r>
               <w:rPr>
                 <w:rFonts w:ascii="Calibri" w:hAnsi="Calibri" w:cs="Calibri"/>
@@ -1815,12 +2230,69 @@
                 <w:lang w:val="en-US"/>
               </w:rPr>
             </w:pPr>
+            <w:proofErr w:type="spellStart"/>
             <w:r>
               <w:rPr>
                 <w:rFonts w:ascii="Calibri" w:hAnsi="Calibri" w:cs="Calibri"/>
                 <w:lang w:val="en-US"/>
               </w:rPr>
-              <w:t>url, angle(facade|interieur|cuisine), date_upload, qualite(HD|SD)</w:t>
+              <w:t>url</w:t>
+            </w:r>
+            <w:proofErr w:type="spellEnd"/>
+            <w:r>
+              <w:rPr>
+                <w:rFonts w:ascii="Calibri" w:hAnsi="Calibri" w:cs="Calibri"/>
+                <w:lang w:val="en-US"/>
+              </w:rPr>
+              <w:t>, angle(</w:t>
+            </w:r>
+            <w:proofErr w:type="spellStart"/>
+            <w:r>
+              <w:rPr>
+                <w:rFonts w:ascii="Calibri" w:hAnsi="Calibri" w:cs="Calibri"/>
+                <w:lang w:val="en-US"/>
+              </w:rPr>
+              <w:t>facade|interieur|cuisine</w:t>
+            </w:r>
+            <w:proofErr w:type="spellEnd"/>
+            <w:r>
+              <w:rPr>
+                <w:rFonts w:ascii="Calibri" w:hAnsi="Calibri" w:cs="Calibri"/>
+                <w:lang w:val="en-US"/>
+              </w:rPr>
+              <w:t xml:space="preserve">), </w:t>
+            </w:r>
+            <w:proofErr w:type="spellStart"/>
+            <w:r>
+              <w:rPr>
+                <w:rFonts w:ascii="Calibri" w:hAnsi="Calibri" w:cs="Calibri"/>
+                <w:lang w:val="en-US"/>
+              </w:rPr>
+              <w:t>date_upload</w:t>
+            </w:r>
+            <w:proofErr w:type="spellEnd"/>
+            <w:r>
+              <w:rPr>
+                <w:rFonts w:ascii="Calibri" w:hAnsi="Calibri" w:cs="Calibri"/>
+                <w:lang w:val="en-US"/>
+              </w:rPr>
+              <w:t xml:space="preserve">, </w:t>
+            </w:r>
+            <w:proofErr w:type="spellStart"/>
+            <w:r>
+              <w:rPr>
+                <w:rFonts w:ascii="Calibri" w:hAnsi="Calibri" w:cs="Calibri"/>
+                <w:lang w:val="en-US"/>
+              </w:rPr>
+              <w:t>qualite</w:t>
+            </w:r>
+            <w:proofErr w:type="spellEnd"/>
+            <w:r>
+              <w:rPr>
+                <w:rFonts w:ascii="Calibri" w:hAnsi="Calibri" w:cs="Calibri"/>
+                <w:lang w:val="en-US"/>
+              </w:rPr>
+              <w:t>(HD|SD)</w:t>
             </w:r>
             <w:r>
               <w:rPr>
@@ -1896,8 +2368,8 @@
       <w:tblGrid>
         <w:gridCol w:w="3234"/>
         <w:gridCol w:w="2220"/>
-        <w:gridCol w:w="2882"/>
-        <w:gridCol w:w="1897"/>
+        <w:gridCol w:w="2857"/>
+        <w:gridCol w:w="1922"/>
       </w:tblGrid>
       <w:tr>
         <w:trPr>
@@ -2030,8 +2502,16 @@
               <w:rPr>
                 <w:rFonts w:ascii="Calibri" w:hAnsi="Calibri" w:cs="Calibri"/>
               </w:rPr>
-              <w:t>User → Propriete</w:t>
-            </w:r>
+              <w:t xml:space="preserve">User → </w:t>
+            </w:r>
+            <w:proofErr w:type="spellStart"/>
+            <w:r>
+              <w:rPr>
+                <w:rFonts w:ascii="Calibri" w:hAnsi="Calibri" w:cs="Calibri"/>
+              </w:rPr>
+              <w:t>Propriete</w:t>
+            </w:r>
+            <w:proofErr w:type="spellEnd"/>
           </w:p>
         </w:tc>
         <w:tc>
@@ -2047,11 +2527,19 @@
                 <w:rFonts w:ascii="Calibri" w:hAnsi="Calibri" w:cs="Calibri"/>
               </w:rPr>
             </w:pPr>
-            <w:r>
-              <w:rPr>
-                <w:rFonts w:ascii="Calibri" w:hAnsi="Calibri" w:cs="Calibri"/>
-              </w:rPr>
-              <w:t>date_ajout, note</w:t>
+            <w:proofErr w:type="spellStart"/>
+            <w:r>
+              <w:rPr>
+                <w:rFonts w:ascii="Calibri" w:hAnsi="Calibri" w:cs="Calibri"/>
+              </w:rPr>
+              <w:t>date_ajout</w:t>
+            </w:r>
+            <w:proofErr w:type="spellEnd"/>
+            <w:r>
+              <w:rPr>
+                <w:rFonts w:ascii="Calibri" w:hAnsi="Calibri" w:cs="Calibri"/>
+              </w:rPr>
+              <w:t>, note</w:t>
             </w:r>
           </w:p>
         </w:tc>
@@ -2211,8 +2699,16 @@
               <w:rPr>
                 <w:rFonts w:ascii="Calibri" w:hAnsi="Calibri" w:cs="Calibri"/>
               </w:rPr>
-              <w:t>Agence → Propriete</w:t>
-            </w:r>
+              <w:t xml:space="preserve">Agence → </w:t>
+            </w:r>
+            <w:proofErr w:type="spellStart"/>
+            <w:r>
+              <w:rPr>
+                <w:rFonts w:ascii="Calibri" w:hAnsi="Calibri" w:cs="Calibri"/>
+              </w:rPr>
+              <w:t>Propriete</w:t>
+            </w:r>
+            <w:proofErr w:type="spellEnd"/>
           </w:p>
         </w:tc>
         <w:tc>
@@ -2228,12 +2724,14 @@
                 <w:rFonts w:ascii="Calibri" w:hAnsi="Calibri" w:cs="Calibri"/>
               </w:rPr>
             </w:pPr>
+            <w:proofErr w:type="spellStart"/>
             <w:r>
               <w:rPr>
                 <w:rFonts w:ascii="Calibri" w:hAnsi="Calibri" w:cs="Calibri"/>
               </w:rPr>
               <w:t>date_depot</w:t>
             </w:r>
+            <w:proofErr w:type="spellEnd"/>
           </w:p>
         </w:tc>
         <w:tc>
@@ -2293,12 +2791,28 @@
                 <w:rFonts w:ascii="Calibri" w:hAnsi="Calibri" w:cs="Calibri"/>
               </w:rPr>
             </w:pPr>
-            <w:r>
-              <w:rPr>
-                <w:rFonts w:ascii="Calibri" w:hAnsi="Calibri" w:cs="Calibri"/>
-              </w:rPr>
-              <w:t>Propriete → Propriete</w:t>
-            </w:r>
+            <w:proofErr w:type="spellStart"/>
+            <w:r>
+              <w:rPr>
+                <w:rFonts w:ascii="Calibri" w:hAnsi="Calibri" w:cs="Calibri"/>
+              </w:rPr>
+              <w:t>Propriete</w:t>
+            </w:r>
+            <w:proofErr w:type="spellEnd"/>
+            <w:r>
+              <w:rPr>
+                <w:rFonts w:ascii="Calibri" w:hAnsi="Calibri" w:cs="Calibri"/>
+              </w:rPr>
+              <w:t xml:space="preserve"> → </w:t>
+            </w:r>
+            <w:proofErr w:type="spellStart"/>
+            <w:r>
+              <w:rPr>
+                <w:rFonts w:ascii="Calibri" w:hAnsi="Calibri" w:cs="Calibri"/>
+              </w:rPr>
+              <w:t>Propriete</w:t>
+            </w:r>
+            <w:proofErr w:type="spellEnd"/>
           </w:p>
         </w:tc>
         <w:tc>
@@ -2314,6 +2828,7 @@
                 <w:rFonts w:ascii="Calibri" w:hAnsi="Calibri" w:cs="Calibri"/>
               </w:rPr>
             </w:pPr>
+            <w:proofErr w:type="spellStart"/>
             <w:r>
               <w:rPr>
                 <w:rFonts w:ascii="Calibri" w:hAnsi="Calibri" w:cs="Calibri"/>
@@ -2332,6 +2847,7 @@
               </w:rPr>
               <w:t>m</w:t>
             </w:r>
+            <w:proofErr w:type="spellEnd"/>
           </w:p>
         </w:tc>
         <w:tc>
@@ -2394,12 +2910,28 @@
                 <w:rFonts w:ascii="Calibri" w:hAnsi="Calibri" w:cs="Calibri"/>
               </w:rPr>
             </w:pPr>
-            <w:r>
-              <w:rPr>
-                <w:rFonts w:ascii="Calibri" w:hAnsi="Calibri" w:cs="Calibri"/>
-              </w:rPr>
-              <w:t>Propriete → Propriete</w:t>
-            </w:r>
+            <w:proofErr w:type="spellStart"/>
+            <w:r>
+              <w:rPr>
+                <w:rFonts w:ascii="Calibri" w:hAnsi="Calibri" w:cs="Calibri"/>
+              </w:rPr>
+              <w:t>Propriete</w:t>
+            </w:r>
+            <w:proofErr w:type="spellEnd"/>
+            <w:r>
+              <w:rPr>
+                <w:rFonts w:ascii="Calibri" w:hAnsi="Calibri" w:cs="Calibri"/>
+              </w:rPr>
+              <w:t xml:space="preserve"> → </w:t>
+            </w:r>
+            <w:proofErr w:type="spellStart"/>
+            <w:r>
+              <w:rPr>
+                <w:rFonts w:ascii="Calibri" w:hAnsi="Calibri" w:cs="Calibri"/>
+              </w:rPr>
+              <w:t>Propriete</w:t>
+            </w:r>
+            <w:proofErr w:type="spellEnd"/>
           </w:p>
         </w:tc>
         <w:tc>
@@ -2415,6 +2947,7 @@
                 <w:rFonts w:ascii="Calibri" w:hAnsi="Calibri" w:cs="Calibri"/>
               </w:rPr>
             </w:pPr>
+            <w:proofErr w:type="spellStart"/>
             <w:r>
               <w:rPr>
                 <w:rFonts w:ascii="Calibri" w:hAnsi="Calibri" w:cs="Calibri"/>
@@ -2433,6 +2966,7 @@
               </w:rPr>
               <w:t>imilarite</w:t>
             </w:r>
+            <w:proofErr w:type="spellEnd"/>
           </w:p>
         </w:tc>
         <w:tc>
@@ -2696,12 +3230,14 @@
               </w:rPr>
               <w:t xml:space="preserve">les </w:t>
             </w:r>
+            <w:proofErr w:type="spellStart"/>
             <w:r>
               <w:rPr>
                 <w:rFonts w:ascii="Calibri" w:hAnsi="Calibri" w:cs="Calibri"/>
               </w:rPr>
               <w:t>users</w:t>
             </w:r>
+            <w:proofErr w:type="spellEnd"/>
           </w:p>
         </w:tc>
       </w:tr>
@@ -2740,11 +3276,19 @@
                 <w:rFonts w:ascii="Calibri" w:hAnsi="Calibri" w:cs="Calibri"/>
               </w:rPr>
             </w:pPr>
-            <w:r>
-              <w:rPr>
-                <w:rFonts w:ascii="Calibri" w:hAnsi="Calibri" w:cs="Calibri"/>
-              </w:rPr>
-              <w:t>Propriete → Localisation</w:t>
+            <w:proofErr w:type="spellStart"/>
+            <w:r>
+              <w:rPr>
+                <w:rFonts w:ascii="Calibri" w:hAnsi="Calibri" w:cs="Calibri"/>
+              </w:rPr>
+              <w:t>Propriete</w:t>
+            </w:r>
+            <w:proofErr w:type="spellEnd"/>
+            <w:r>
+              <w:rPr>
+                <w:rFonts w:ascii="Calibri" w:hAnsi="Calibri" w:cs="Calibri"/>
+              </w:rPr>
+              <w:t xml:space="preserve"> → Localisation</w:t>
             </w:r>
           </w:p>
         </w:tc>
@@ -2829,12 +3373,28 @@
                 <w:rFonts w:ascii="Calibri" w:hAnsi="Calibri" w:cs="Calibri"/>
               </w:rPr>
             </w:pPr>
-            <w:r>
-              <w:rPr>
-                <w:rFonts w:ascii="Calibri" w:hAnsi="Calibri" w:cs="Calibri"/>
-              </w:rPr>
-              <w:t>Propriete → Amenagement</w:t>
-            </w:r>
+            <w:proofErr w:type="spellStart"/>
+            <w:r>
+              <w:rPr>
+                <w:rFonts w:ascii="Calibri" w:hAnsi="Calibri" w:cs="Calibri"/>
+              </w:rPr>
+              <w:t>Propriete</w:t>
+            </w:r>
+            <w:proofErr w:type="spellEnd"/>
+            <w:r>
+              <w:rPr>
+                <w:rFonts w:ascii="Calibri" w:hAnsi="Calibri" w:cs="Calibri"/>
+              </w:rPr>
+              <w:t xml:space="preserve"> → </w:t>
+            </w:r>
+            <w:proofErr w:type="spellStart"/>
+            <w:r>
+              <w:rPr>
+                <w:rFonts w:ascii="Calibri" w:hAnsi="Calibri" w:cs="Calibri"/>
+              </w:rPr>
+              <w:t>Amenagement</w:t>
+            </w:r>
+            <w:proofErr w:type="spellEnd"/>
           </w:p>
         </w:tc>
         <w:tc>
@@ -2898,7 +3458,19 @@
               <w:rPr>
                 <w:rFonts w:ascii="Calibri" w:hAnsi="Calibri" w:cs="Calibri"/>
               </w:rPr>
-              <w:t xml:space="preserve">APHOTO </w:t>
+              <w:t>A</w:t>
+            </w:r>
+            <w:r>
+              <w:rPr>
+                <w:rFonts w:ascii="Calibri" w:hAnsi="Calibri" w:cs="Calibri"/>
+              </w:rPr>
+              <w:t>_</w:t>
+            </w:r>
+            <w:r>
+              <w:rPr>
+                <w:rFonts w:ascii="Calibri" w:hAnsi="Calibri" w:cs="Calibri"/>
+              </w:rPr>
+              <w:t xml:space="preserve">PHOTO </w:t>
             </w:r>
           </w:p>
         </w:tc>
@@ -2915,11 +3487,19 @@
                 <w:rFonts w:ascii="Calibri" w:hAnsi="Calibri" w:cs="Calibri"/>
               </w:rPr>
             </w:pPr>
-            <w:r>
-              <w:rPr>
-                <w:rFonts w:ascii="Calibri" w:hAnsi="Calibri" w:cs="Calibri"/>
-              </w:rPr>
-              <w:t>Propriete → Photo</w:t>
+            <w:proofErr w:type="spellStart"/>
+            <w:r>
+              <w:rPr>
+                <w:rFonts w:ascii="Calibri" w:hAnsi="Calibri" w:cs="Calibri"/>
+              </w:rPr>
+              <w:t>Propriete</w:t>
+            </w:r>
+            <w:proofErr w:type="spellEnd"/>
+            <w:r>
+              <w:rPr>
+                <w:rFonts w:ascii="Calibri" w:hAnsi="Calibri" w:cs="Calibri"/>
+              </w:rPr>
+              <w:t xml:space="preserve"> → Photo</w:t>
             </w:r>
           </w:p>
         </w:tc>
@@ -3017,12 +3597,14 @@
               </w:rPr>
               <w:t xml:space="preserve">User → </w:t>
             </w:r>
+            <w:proofErr w:type="spellStart"/>
             <w:r>
               <w:rPr>
                 <w:rFonts w:cstheme="minorHAnsi"/>
               </w:rPr>
               <w:t>Propriete</w:t>
             </w:r>
+            <w:proofErr w:type="spellEnd"/>
           </w:p>
         </w:tc>
         <w:tc>
@@ -3036,11 +3618,33 @@
                 <w:rFonts w:ascii="Calibri" w:hAnsi="Calibri" w:cs="Calibri"/>
               </w:rPr>
             </w:pPr>
-            <w:r>
-              <w:rPr>
-                <w:rFonts w:ascii="Calibri" w:hAnsi="Calibri" w:cs="Calibri"/>
-              </w:rPr>
-              <w:t>date_souhaitee, heure, statut, date_creation, message</w:t>
+            <w:proofErr w:type="spellStart"/>
+            <w:r>
+              <w:rPr>
+                <w:rFonts w:ascii="Calibri" w:hAnsi="Calibri" w:cs="Calibri"/>
+              </w:rPr>
+              <w:t>date_souhaitee</w:t>
+            </w:r>
+            <w:proofErr w:type="spellEnd"/>
+            <w:r>
+              <w:rPr>
+                <w:rFonts w:ascii="Calibri" w:hAnsi="Calibri" w:cs="Calibri"/>
+              </w:rPr>
+              <w:t xml:space="preserve">, heure, statut, </w:t>
+            </w:r>
+            <w:proofErr w:type="spellStart"/>
+            <w:r>
+              <w:rPr>
+                <w:rFonts w:ascii="Calibri" w:hAnsi="Calibri" w:cs="Calibri"/>
+              </w:rPr>
+              <w:t>date_creation</w:t>
+            </w:r>
+            <w:proofErr w:type="spellEnd"/>
+            <w:r>
+              <w:rPr>
+                <w:rFonts w:ascii="Calibri" w:hAnsi="Calibri" w:cs="Calibri"/>
+              </w:rPr>
+              <w:t>, message</w:t>
             </w:r>
           </w:p>
         </w:tc>
@@ -3111,8 +3715,16 @@
               <w:rPr>
                 <w:rFonts w:ascii="Calibri" w:hAnsi="Calibri" w:cs="Calibri"/>
               </w:rPr>
-              <w:t>→ Propriete</w:t>
-            </w:r>
+              <w:t xml:space="preserve">→ </w:t>
+            </w:r>
+            <w:proofErr w:type="spellStart"/>
+            <w:r>
+              <w:rPr>
+                <w:rFonts w:ascii="Calibri" w:hAnsi="Calibri" w:cs="Calibri"/>
+              </w:rPr>
+              <w:t>Propriete</w:t>
+            </w:r>
+            <w:proofErr w:type="spellEnd"/>
           </w:p>
         </w:tc>
         <w:tc>
@@ -3143,8 +3755,16 @@
               <w:rPr>
                 <w:rFonts w:ascii="Calibri" w:hAnsi="Calibri" w:cs="Calibri"/>
               </w:rPr>
-              <w:t>Visites des proprietes</w:t>
-            </w:r>
+              <w:t xml:space="preserve">Visites des </w:t>
+            </w:r>
+            <w:proofErr w:type="spellStart"/>
+            <w:r>
+              <w:rPr>
+                <w:rFonts w:ascii="Calibri" w:hAnsi="Calibri" w:cs="Calibri"/>
+              </w:rPr>
+              <w:t>proprietes</w:t>
+            </w:r>
+            <w:proofErr w:type="spellEnd"/>
           </w:p>
         </w:tc>
       </w:tr>
@@ -3186,12 +3806,28 @@
                 <w:rFonts w:ascii="Calibri" w:hAnsi="Calibri" w:cs="Calibri"/>
               </w:rPr>
             </w:pPr>
-            <w:r>
-              <w:rPr>
-                <w:rFonts w:ascii="Calibri" w:hAnsi="Calibri" w:cs="Calibri"/>
-              </w:rPr>
-              <w:t>Propriete → Propriete</w:t>
-            </w:r>
+            <w:proofErr w:type="spellStart"/>
+            <w:r>
+              <w:rPr>
+                <w:rFonts w:ascii="Calibri" w:hAnsi="Calibri" w:cs="Calibri"/>
+              </w:rPr>
+              <w:t>Propriete</w:t>
+            </w:r>
+            <w:proofErr w:type="spellEnd"/>
+            <w:r>
+              <w:rPr>
+                <w:rFonts w:ascii="Calibri" w:hAnsi="Calibri" w:cs="Calibri"/>
+              </w:rPr>
+              <w:t xml:space="preserve"> → </w:t>
+            </w:r>
+            <w:proofErr w:type="spellStart"/>
+            <w:r>
+              <w:rPr>
+                <w:rFonts w:ascii="Calibri" w:hAnsi="Calibri" w:cs="Calibri"/>
+              </w:rPr>
+              <w:t>Propriete</w:t>
+            </w:r>
+            <w:proofErr w:type="spellEnd"/>
           </w:p>
         </w:tc>
         <w:tc>
@@ -3207,12 +3843,26 @@
                 <w:rFonts w:ascii="Calibri" w:hAnsi="Calibri" w:cs="Calibri"/>
               </w:rPr>
             </w:pPr>
-            <w:r>
-              <w:rPr>
-                <w:rFonts w:ascii="Calibri" w:hAnsi="Calibri" w:cs="Calibri"/>
-              </w:rPr>
-              <w:t>score_amenagement</w:t>
-            </w:r>
+            <w:proofErr w:type="spellStart"/>
+            <w:r>
+              <w:rPr>
+                <w:rFonts w:ascii="Calibri" w:hAnsi="Calibri" w:cs="Calibri"/>
+              </w:rPr>
+              <w:t>score</w:t>
+            </w:r>
+            <w:r>
+              <w:rPr>
+                <w:rFonts w:ascii="Calibri" w:hAnsi="Calibri" w:cs="Calibri"/>
+              </w:rPr>
+              <w:t>A</w:t>
+            </w:r>
+            <w:r>
+              <w:rPr>
+                <w:rFonts w:ascii="Calibri" w:hAnsi="Calibri" w:cs="Calibri"/>
+              </w:rPr>
+              <w:t>menagement</w:t>
+            </w:r>
+            <w:proofErr w:type="spellEnd"/>
           </w:p>
         </w:tc>
         <w:tc>
@@ -3299,7 +3949,23 @@
         <w:t xml:space="preserve"> </w:t>
       </w:r>
       <w:r>
-        <w:t>: JWT tokens, CORS configuré, validation Pydantic, protection données RGPD</w:t>
+        <w:t xml:space="preserve">: JWT </w:t>
+      </w:r>
+      <w:proofErr w:type="spellStart"/>
+      <w:r>
+        <w:t>tokens</w:t>
+      </w:r>
+      <w:proofErr w:type="spellEnd"/>
+      <w:r>
+        <w:t xml:space="preserve">, CORS configuré, validation </w:t>
+      </w:r>
+      <w:proofErr w:type="spellStart"/>
+      <w:r>
+        <w:t>Pydantic</w:t>
+      </w:r>
+      <w:proofErr w:type="spellEnd"/>
+      <w:r>
+        <w:t>, protection données RGPD</w:t>
       </w:r>
     </w:p>
     <w:p>
@@ -3362,7 +4028,21 @@
         <w:rPr>
           <w:lang w:val="en-US"/>
         </w:rPr>
-        <w:t>: Types propagés end-to-end (Neo4j → FastAPI → GraphQL → React TypeScript)</w:t>
+        <w:t xml:space="preserve">: Types </w:t>
+      </w:r>
+      <w:proofErr w:type="spellStart"/>
+      <w:r>
+        <w:rPr>
+          <w:lang w:val="en-US"/>
+        </w:rPr>
+        <w:t>propagés</w:t>
+      </w:r>
+      <w:proofErr w:type="spellEnd"/>
+      <w:r>
+        <w:rPr>
+          <w:lang w:val="en-US"/>
+        </w:rPr>
+        <w:t xml:space="preserve"> end-to-end (Neo4j → FastAPI → GraphQL → React TypeScript)</w:t>
       </w:r>
     </w:p>
     <w:p>
@@ -3379,7 +4059,15 @@
         <w:t xml:space="preserve"> </w:t>
       </w:r>
       <w:r>
-        <w:t>: Gestion erreurs robuste, cache Apollo Client, retry automatique</w:t>
+        <w:t xml:space="preserve">: Gestion erreurs robuste, cache Apollo Client, </w:t>
+      </w:r>
+      <w:proofErr w:type="spellStart"/>
+      <w:r>
+        <w:t>retry</w:t>
+      </w:r>
+      <w:proofErr w:type="spellEnd"/>
+      <w:r>
+        <w:t xml:space="preserve"> automatique</w:t>
       </w:r>
     </w:p>
     <w:p>
@@ -3418,14 +4106,16 @@
       </w:r>
     </w:p>
     <w:p>
-      <w:pPr>
-        <w:numPr>
-          <w:ilvl w:val="0"/>
-          <w:numId w:val="17"/>
-        </w:numPr>
-      </w:pPr>
-      <w:r>
-        <w:t>Frontend React : localhost:</w:t>
+      <w:r>
+        <w:t xml:space="preserve">Frontend </w:t>
+      </w:r>
+      <w:proofErr w:type="spellStart"/>
+      <w:r>
+        <w:t>React</w:t>
+      </w:r>
+      <w:proofErr w:type="spellEnd"/>
+      <w:r>
+        <w:t xml:space="preserve"> : localhost:</w:t>
       </w:r>
       <w:r>
         <w:t>5173</w:t>
@@ -3488,7 +4178,21 @@
         <w:rPr>
           <w:lang w:val="en-US"/>
         </w:rPr>
-        <w:t xml:space="preserve"> Déploiement cloud (Heroku, Railway, AWS)</w:t>
+        <w:t xml:space="preserve"> </w:t>
+      </w:r>
+      <w:proofErr w:type="spellStart"/>
+      <w:r>
+        <w:rPr>
+          <w:lang w:val="en-US"/>
+        </w:rPr>
+        <w:t>Déploiement</w:t>
+      </w:r>
+      <w:proofErr w:type="spellEnd"/>
+      <w:r>
+        <w:rPr>
+          <w:lang w:val="en-US"/>
+        </w:rPr>
+        <w:t xml:space="preserve"> cloud (Heroku, Railway, AWS)</w:t>
       </w:r>
     </w:p>
     <w:p>
@@ -3500,8 +4204,21 @@
       </w:pPr>
       <w:r>
         <w:lastRenderedPageBreak/>
-        <w:t>Frontend : Vercel ou Netlify</w:t>
-      </w:r>
+        <w:t xml:space="preserve">Frontend : </w:t>
+      </w:r>
+      <w:proofErr w:type="spellStart"/>
+      <w:r>
+        <w:t>Vercel</w:t>
+      </w:r>
+      <w:proofErr w:type="spellEnd"/>
+      <w:r>
+        <w:t xml:space="preserve"> ou </w:t>
+      </w:r>
+      <w:proofErr w:type="spellStart"/>
+      <w:r>
+        <w:t>Netlify</w:t>
+      </w:r>
+      <w:proofErr w:type="spellEnd"/>
     </w:p>
     <w:p>
       <w:pPr>
@@ -3656,8 +4373,13 @@
               <w:cnfStyle w:val="000000100000" w:firstRow="0" w:lastRow="0" w:firstColumn="0" w:lastColumn="0" w:oddVBand="0" w:evenVBand="0" w:oddHBand="1" w:evenHBand="0" w:firstRowFirstColumn="0" w:firstRowLastColumn="0" w:lastRowFirstColumn="0" w:lastRowLastColumn="0"/>
             </w:pPr>
             <w:r>
-              <w:t>Modèle Neo4j finalisé, diagrammes UML/Arrows</w:t>
-            </w:r>
+              <w:t>Modèle Neo4j finalisé, diagrammes UML/</w:t>
+            </w:r>
+            <w:proofErr w:type="spellStart"/>
+            <w:r>
+              <w:t>Arrows</w:t>
+            </w:r>
+            <w:proofErr w:type="spellEnd"/>
           </w:p>
         </w:tc>
       </w:tr>
@@ -3706,7 +4428,23 @@
               <w:cnfStyle w:val="000000000000" w:firstRow="0" w:lastRow="0" w:firstColumn="0" w:lastColumn="0" w:oddVBand="0" w:evenVBand="0" w:oddHBand="0" w:evenHBand="0" w:firstRowFirstColumn="0" w:firstRowLastColumn="0" w:lastRowFirstColumn="0" w:lastRowLastColumn="0"/>
             </w:pPr>
             <w:r>
-              <w:t>FastAPI endpoints, GraphQL schema, connexion Neo4j</w:t>
+              <w:t xml:space="preserve">FastAPI </w:t>
+            </w:r>
+            <w:proofErr w:type="spellStart"/>
+            <w:r>
+              <w:t>endpoints</w:t>
+            </w:r>
+            <w:proofErr w:type="spellEnd"/>
+            <w:r>
+              <w:t xml:space="preserve">, GraphQL </w:t>
+            </w:r>
+            <w:proofErr w:type="spellStart"/>
+            <w:r>
+              <w:t>schema</w:t>
+            </w:r>
+            <w:proofErr w:type="spellEnd"/>
+            <w:r>
+              <w:t>, connexion Neo4j</w:t>
             </w:r>
           </w:p>
         </w:tc>
@@ -3819,8 +4557,16 @@
               <w:rPr>
                 <w:lang w:val="en-US"/>
               </w:rPr>
-              <w:t>Tests end-to-end, correction bugs, optimisation</w:t>
-            </w:r>
+              <w:t xml:space="preserve">Tests end-to-end, correction bugs, </w:t>
+            </w:r>
+            <w:proofErr w:type="spellStart"/>
+            <w:r>
+              <w:rPr>
+                <w:lang w:val="en-US"/>
+              </w:rPr>
+              <w:t>optimisation</w:t>
+            </w:r>
+            <w:proofErr w:type="spellEnd"/>
           </w:p>
         </w:tc>
       </w:tr>
@@ -3857,9 +4603,11 @@
       <w:r>
         <w:t xml:space="preserve"> </w:t>
       </w:r>
+      <w:proofErr w:type="spellStart"/>
       <w:r>
         <w:t>GraphImmo</w:t>
       </w:r>
+      <w:proofErr w:type="spellEnd"/>
       <w:r>
         <w:t xml:space="preserve"> </w:t>
       </w:r>

</xml_diff>